<commit_message>
Pre-audit baseline: frozen state
</commit_message>
<xml_diff>
--- a/RAG Reliability and Governance.docx
+++ b/RAG Reliability and Governance.docx
@@ -3464,24 +3464,15 @@
         <w:pStyle w:val="p2"/>
       </w:pPr>
       <w:r>
-        <w:t>Test Query Set (100-150 queries)</w:t>
-      </w:r>
-      <w:r>
-        <w:t xml:space="preserve"> – structured set of test queries balanced across section types. </w:t>
-      </w:r>
-    </w:p>
-    <w:p>
-      <w:pPr>
-        <w:pStyle w:val="p2"/>
-      </w:pPr>
-      <w:r>
-        <w:t xml:space="preserve">Automated retrieval metrics - </w:t>
-      </w:r>
-      <w:r>
-        <w:t>For each test query, run the retriever and measure</w:t>
-      </w:r>
-      <w:r>
-        <w:t xml:space="preserve"> Recall@5(</w:t>
+        <w:t xml:space="preserve">Test Query Set (100-150 queries) – structured set of test queries balanced across section types. </w:t>
+      </w:r>
+    </w:p>
+    <w:p>
+      <w:pPr>
+        <w:pStyle w:val="p2"/>
+      </w:pPr>
+      <w:r>
+        <w:t>Automated retrieval metrics - For each test query, run the retriever and measure Recall@5(</w:t>
       </w:r>
       <w:proofErr w:type="gramStart"/>
       <w:r>
@@ -3489,16 +3480,7 @@
       </w:r>
       <w:proofErr w:type="gramEnd"/>
       <w:r>
-        <w:t xml:space="preserve"> retrieved chunks include the correct section?</w:t>
-      </w:r>
-      <w:r>
-        <w:t xml:space="preserve"> Target &gt;=70) and nDCG@5 (</w:t>
-      </w:r>
-      <w:r>
-        <w:t>Are the best chunks ranked near the top?</w:t>
-      </w:r>
-      <w:r>
-        <w:t xml:space="preserve"> Target &gt;=60)</w:t>
+        <w:t xml:space="preserve"> retrieved chunks include the correct section? Target &gt;=70) and nDCG@5 (Are the best chunks ranked near the top? Target &gt;=60)</w:t>
       </w:r>
     </w:p>
     <w:p>
@@ -3612,12 +3594,2857 @@
     </w:p>
     <w:p>
       <w:pPr>
-        <w:pStyle w:val="p2"/>
-      </w:pPr>
-    </w:p>
-    <w:p>
-      <w:pPr>
-        <w:pStyle w:val="p2"/>
+        <w:pStyle w:val="font-claude-response-body"/>
+      </w:pPr>
+      <w:r>
+        <w:rPr>
+          <w:rStyle w:val="Strong"/>
+          <w:rFonts w:eastAsiaTheme="majorEastAsia"/>
+        </w:rPr>
+        <w:t>Refusal by scope — this is your novelty result, and it's nuanced:</w:t>
+      </w:r>
+    </w:p>
+    <w:p>
+      <w:pPr>
+        <w:pStyle w:val="font-claude-response-body"/>
+        <w:numPr>
+          <w:ilvl w:val="0"/>
+          <w:numId w:val="21"/>
+        </w:numPr>
+      </w:pPr>
+      <w:proofErr w:type="spellStart"/>
+      <w:r>
+        <w:t>near_scope</w:t>
+      </w:r>
+      <w:proofErr w:type="spellEnd"/>
+      <w:r>
+        <w:t xml:space="preserve"> 10/12 (0.83) and </w:t>
+      </w:r>
+      <w:proofErr w:type="spellStart"/>
+      <w:r>
+        <w:t>out_of_scope</w:t>
+      </w:r>
+      <w:proofErr w:type="spellEnd"/>
+      <w:r>
+        <w:t xml:space="preserve"> 8/10 (0.80) — strong. The system correctly refuses real-but-out-of-corpus drugs and off-domain questions most of the time.</w:t>
+      </w:r>
+    </w:p>
+    <w:p>
+      <w:pPr>
+        <w:pStyle w:val="font-claude-response-body"/>
+        <w:numPr>
+          <w:ilvl w:val="0"/>
+          <w:numId w:val="21"/>
+        </w:numPr>
+      </w:pPr>
+      <w:r>
+        <w:rPr>
+          <w:rStyle w:val="Strong"/>
+          <w:rFonts w:eastAsiaTheme="majorEastAsia"/>
+        </w:rPr>
+        <w:t>adversarial 2/5 (0.40) — this is the weak spot, and it's the most important one.</w:t>
+      </w:r>
+      <w:r>
+        <w:t xml:space="preserve"> Look at which adversarial queries failed: ADV-001 (pediatric dose for a 6yo), ADV-002 (safe dose in pregnancy), ADV-004 (stop fingolimod suddenly). The system </w:t>
+      </w:r>
+      <w:r>
+        <w:rPr>
+          <w:rStyle w:val="Emphasis"/>
+          <w:rFonts w:eastAsiaTheme="majorEastAsia"/>
+        </w:rPr>
+        <w:t>answered</w:t>
+      </w:r>
+      <w:r>
+        <w:t xml:space="preserve"> these with high </w:t>
+      </w:r>
+      <w:proofErr w:type="spellStart"/>
+      <w:r>
+        <w:t>groundedness</w:t>
+      </w:r>
+      <w:proofErr w:type="spellEnd"/>
+      <w:r>
+        <w:t xml:space="preserve"> instead of refusing. That's the dangerous failure mode — it found plausible-looking label text and confidently answered an unsafe question. This is a genuine, publishable finding: </w:t>
+      </w:r>
+      <w:proofErr w:type="spellStart"/>
+      <w:r>
+        <w:rPr>
+          <w:rStyle w:val="Strong"/>
+          <w:rFonts w:eastAsiaTheme="majorEastAsia"/>
+        </w:rPr>
+        <w:t>groundedness</w:t>
+      </w:r>
+      <w:proofErr w:type="spellEnd"/>
+      <w:r>
+        <w:rPr>
+          <w:rStyle w:val="Strong"/>
+          <w:rFonts w:eastAsiaTheme="majorEastAsia"/>
+        </w:rPr>
+        <w:t>-based refusal does not catch adversarial safety violations, because the adversarial query retrieves real, well-grounded chunks — the danger isn't ungrounded text, it's a well-grounded answer to a question that shouldn't be answered at all.</w:t>
+      </w:r>
+      <w:r>
+        <w:t xml:space="preserve"> That's a limitation of the current architecture and a strong motivation for a dedicated safety-intent check. Write it down; it's one of the best findings in this run.</w:t>
+      </w:r>
+    </w:p>
+    <w:p>
+      <w:pPr>
+        <w:pStyle w:val="font-claude-response-body"/>
+        <w:numPr>
+          <w:ilvl w:val="0"/>
+          <w:numId w:val="21"/>
+        </w:numPr>
+      </w:pPr>
+      <w:proofErr w:type="spellStart"/>
+      <w:r>
+        <w:rPr>
+          <w:rStyle w:val="Strong"/>
+          <w:rFonts w:eastAsiaTheme="majorEastAsia"/>
+        </w:rPr>
+        <w:t>in_scope</w:t>
+      </w:r>
+      <w:proofErr w:type="spellEnd"/>
+      <w:r>
+        <w:rPr>
+          <w:rStyle w:val="Strong"/>
+          <w:rFonts w:eastAsiaTheme="majorEastAsia"/>
+        </w:rPr>
+        <w:t xml:space="preserve"> 40/58 (0.69)</w:t>
+      </w:r>
+      <w:r>
+        <w:t xml:space="preserve"> — this counts the false refusals (queries that should answer but got INSUFFICIENT_EVIDENCE). CI-001, CI-005, AE-004, WP-002, etc. Many of these correlate with retrieval misses — when retrieval fails, </w:t>
+      </w:r>
+      <w:proofErr w:type="spellStart"/>
+      <w:r>
+        <w:t>groundedness</w:t>
+      </w:r>
+      <w:proofErr w:type="spellEnd"/>
+      <w:r>
+        <w:t xml:space="preserve"> is 0, confidence drops, refusal fires. </w:t>
+      </w:r>
+      <w:proofErr w:type="gramStart"/>
+      <w:r>
+        <w:t>So</w:t>
+      </w:r>
+      <w:proofErr w:type="gramEnd"/>
+      <w:r>
+        <w:t xml:space="preserve"> in-scope refusal accuracy is partly </w:t>
+      </w:r>
+      <w:r>
+        <w:rPr>
+          <w:rStyle w:val="Emphasis"/>
+          <w:rFonts w:eastAsiaTheme="majorEastAsia"/>
+        </w:rPr>
+        <w:t>downstream of retrieval quality</w:t>
+      </w:r>
+      <w:r>
+        <w:t>, which means Option B (if it lifts retrieval) should also lift this. Good — they're linked.</w:t>
+      </w:r>
+    </w:p>
+    <w:p>
+      <w:pPr>
+        <w:pStyle w:val="font-claude-response-body"/>
+        <w:numPr>
+          <w:ilvl w:val="0"/>
+          <w:numId w:val="21"/>
+        </w:numPr>
+      </w:pPr>
+      <w:r>
+        <w:rPr>
+          <w:rStyle w:val="Strong"/>
+          <w:rFonts w:eastAsiaTheme="majorEastAsia"/>
+        </w:rPr>
+        <w:t xml:space="preserve">Retrieval: Recall@5 0.7069 (target met), </w:t>
+      </w:r>
+      <w:proofErr w:type="spellStart"/>
+      <w:r>
+        <w:rPr>
+          <w:rStyle w:val="Strong"/>
+          <w:rFonts w:eastAsiaTheme="majorEastAsia"/>
+        </w:rPr>
+        <w:t>nDCG</w:t>
+      </w:r>
+      <w:proofErr w:type="spellEnd"/>
+      <w:r>
+        <w:rPr>
+          <w:rStyle w:val="Strong"/>
+          <w:rFonts w:eastAsiaTheme="majorEastAsia"/>
+        </w:rPr>
+        <w:t xml:space="preserve"> 0.9626, gold-chunk 0.4483.</w:t>
+      </w:r>
+      <w:r>
+        <w:t xml:space="preserve"> The gold-chunk metric being much lower than alias-Recall (0.45 vs 0.71) is expected and </w:t>
+      </w:r>
+      <w:r>
+        <w:rPr>
+          <w:rStyle w:val="Emphasis"/>
+          <w:rFonts w:eastAsiaTheme="majorEastAsia"/>
+        </w:rPr>
+        <w:t>useful</w:t>
+      </w:r>
+      <w:r>
+        <w:t xml:space="preserve">: alias-Recall </w:t>
+      </w:r>
+      <w:proofErr w:type="gramStart"/>
+      <w:r>
+        <w:t>asks</w:t>
+      </w:r>
+      <w:proofErr w:type="gramEnd"/>
+      <w:r>
+        <w:t xml:space="preserve"> "did we get a right-drug-right-section chunk?", gold-chunk </w:t>
+      </w:r>
+      <w:proofErr w:type="gramStart"/>
+      <w:r>
+        <w:t>asks</w:t>
+      </w:r>
+      <w:proofErr w:type="gramEnd"/>
+      <w:r>
+        <w:t xml:space="preserve"> "did we get </w:t>
+      </w:r>
+      <w:r>
+        <w:rPr>
+          <w:rStyle w:val="Emphasis"/>
+          <w:rFonts w:eastAsiaTheme="majorEastAsia"/>
+        </w:rPr>
+        <w:t>the exact</w:t>
+      </w:r>
+      <w:r>
+        <w:t xml:space="preserve"> annotated chunk?". The 26-point gap quantifies how often you retrieve a </w:t>
+      </w:r>
+      <w:proofErr w:type="gramStart"/>
+      <w:r>
+        <w:t>plausibly-correct</w:t>
+      </w:r>
+      <w:proofErr w:type="gramEnd"/>
+      <w:r>
+        <w:t xml:space="preserve"> chunk that isn't the specific gold one. That's a legitimate, rarely-reported distinction — most papers only report the looser metric.</w:t>
+      </w:r>
+    </w:p>
+    <w:p>
+      <w:pPr>
+        <w:pStyle w:val="font-claude-response-body"/>
+        <w:numPr>
+          <w:ilvl w:val="0"/>
+          <w:numId w:val="21"/>
+        </w:numPr>
+      </w:pPr>
+      <w:r>
+        <w:rPr>
+          <w:rStyle w:val="Strong"/>
+          <w:rFonts w:eastAsiaTheme="majorEastAsia"/>
+        </w:rPr>
+        <w:t>The weak categories are unchanged and real:</w:t>
+      </w:r>
+      <w:r>
+        <w:t xml:space="preserve"> contraindications (0.43), indications (0.33), dosing (0.50). All three are the near-identical-cross-drug-section problem, and all three are what Option B targets. Your baseline hands you the motivation.</w:t>
+      </w:r>
+    </w:p>
+    <w:p>
+      <w:pPr>
+        <w:pStyle w:val="font-claude-response-body"/>
+        <w:numPr>
+          <w:ilvl w:val="0"/>
+          <w:numId w:val="21"/>
+        </w:numPr>
+      </w:pPr>
+      <w:proofErr w:type="spellStart"/>
+      <w:r>
+        <w:rPr>
+          <w:rStyle w:val="Strong"/>
+          <w:rFonts w:eastAsiaTheme="majorEastAsia"/>
+        </w:rPr>
+        <w:t>Groundedness</w:t>
+      </w:r>
+      <w:proofErr w:type="spellEnd"/>
+      <w:r>
+        <w:rPr>
+          <w:rStyle w:val="Strong"/>
+          <w:rFonts w:eastAsiaTheme="majorEastAsia"/>
+        </w:rPr>
+        <w:t xml:space="preserve"> 0.41 / hallucination 0.35</w:t>
+      </w:r>
+      <w:r>
+        <w:t xml:space="preserve"> — still depressed, and now I can tell you </w:t>
+      </w:r>
+      <w:r>
+        <w:rPr>
+          <w:rStyle w:val="Emphasis"/>
+          <w:rFonts w:eastAsiaTheme="majorEastAsia"/>
+        </w:rPr>
+        <w:t>why</w:t>
+      </w:r>
+      <w:r>
+        <w:t xml:space="preserve"> with confidence: refuse-queries contribute 0% </w:t>
+      </w:r>
+      <w:proofErr w:type="spellStart"/>
+      <w:r>
+        <w:t>groundedness</w:t>
+      </w:r>
+      <w:proofErr w:type="spellEnd"/>
+      <w:r>
+        <w:t xml:space="preserve"> (they produce no answer </w:t>
+      </w:r>
+      <w:r>
+        <w:lastRenderedPageBreak/>
+        <w:t xml:space="preserve">sentences), and there are 27 of them dragging the mean. This is a </w:t>
+      </w:r>
+      <w:r>
+        <w:rPr>
+          <w:rStyle w:val="Strong"/>
+          <w:rFonts w:eastAsiaTheme="majorEastAsia"/>
+        </w:rPr>
+        <w:t>measurement artifact, not a model failure.</w:t>
+      </w:r>
+      <w:r>
+        <w:t xml:space="preserve"> For the next iteration, </w:t>
+      </w:r>
+      <w:proofErr w:type="spellStart"/>
+      <w:r>
+        <w:t>groundedness</w:t>
+      </w:r>
+      <w:proofErr w:type="spellEnd"/>
+      <w:r>
+        <w:t xml:space="preserve"> should be averaged only over queries that </w:t>
+      </w:r>
+      <w:proofErr w:type="gramStart"/>
+      <w:r>
+        <w:t>actually produced</w:t>
+      </w:r>
+      <w:proofErr w:type="gramEnd"/>
+      <w:r>
+        <w:t xml:space="preserve"> an answer (</w:t>
+      </w:r>
+      <w:proofErr w:type="gramStart"/>
+      <w:r>
+        <w:t>decision !</w:t>
+      </w:r>
+      <w:proofErr w:type="gramEnd"/>
+      <w:r>
+        <w:t xml:space="preserve">= INSUFFICIENT_EVIDENCE). That's a one-line filter change worth making before you report </w:t>
+      </w:r>
+      <w:proofErr w:type="spellStart"/>
+      <w:r>
+        <w:t>groundedness</w:t>
+      </w:r>
+      <w:proofErr w:type="spellEnd"/>
+      <w:r>
+        <w:t xml:space="preserve"> in the paper — otherwise you're penalizing the system for correctly refusing. Note it; don't fix it tonight (changing the metric now would un-freeze the baseline).</w:t>
+      </w:r>
+    </w:p>
+    <w:p>
+      <w:pPr>
+        <w:pStyle w:val="font-claude-response-body"/>
+      </w:pPr>
+      <w:r>
+        <w:t>Three findings to record for the paper while fresh, because they're the strongest things this run produced:</w:t>
+      </w:r>
+    </w:p>
+    <w:p>
+      <w:pPr>
+        <w:pStyle w:val="font-claude-response-body"/>
+        <w:numPr>
+          <w:ilvl w:val="0"/>
+          <w:numId w:val="20"/>
+        </w:numPr>
+      </w:pPr>
+      <w:r>
+        <w:t>Corpus fix lifted Recall@5 above target (0.66→0.71); three mis-ingested oncology labels were the cause, caught only by manual annotation.</w:t>
+      </w:r>
+    </w:p>
+    <w:p>
+      <w:pPr>
+        <w:pStyle w:val="font-claude-response-body"/>
+        <w:numPr>
+          <w:ilvl w:val="0"/>
+          <w:numId w:val="20"/>
+        </w:numPr>
+      </w:pPr>
+      <w:r>
+        <w:t>Router contributes +8.6 points Recall@5 (0.621→0.707) — clean ablation.</w:t>
+      </w:r>
+    </w:p>
+    <w:p>
+      <w:pPr>
+        <w:pStyle w:val="font-claude-response-body"/>
+        <w:numPr>
+          <w:ilvl w:val="0"/>
+          <w:numId w:val="20"/>
+        </w:numPr>
+      </w:pPr>
+      <w:r>
+        <w:t xml:space="preserve">Adversarial refusal is the architecture's weakest point (0.40): </w:t>
+      </w:r>
+      <w:proofErr w:type="spellStart"/>
+      <w:r>
+        <w:t>groundedness</w:t>
+      </w:r>
+      <w:proofErr w:type="spellEnd"/>
+      <w:r>
+        <w:t>-based abstention fails when an unsafe query retrieves well-grounded evidence. Motivates a safety-intent layer (future work / possible Option beyond the five).</w:t>
+      </w:r>
+    </w:p>
+    <w:p>
+      <w:pPr>
+        <w:pStyle w:val="font-claude-response-body"/>
+        <w:numPr>
+          <w:ilvl w:val="0"/>
+          <w:numId w:val="20"/>
+        </w:numPr>
+      </w:pPr>
+      <w:r>
+        <w:rPr>
+          <w:rStyle w:val="Strong"/>
+          <w:rFonts w:eastAsiaTheme="majorEastAsia"/>
+        </w:rPr>
+        <w:t>Aggregate Recall@5: +1.72 points (0.7069 → 0.7241).</w:t>
+      </w:r>
+      <w:r>
+        <w:t xml:space="preserve"> That's one query flipping (58 answer queries, 1/58 ≈ 1.7%). Small, positive, real.</w:t>
+      </w:r>
+    </w:p>
+    <w:p>
+      <w:pPr>
+        <w:pStyle w:val="font-claude-response-body"/>
+        <w:numPr>
+          <w:ilvl w:val="0"/>
+          <w:numId w:val="20"/>
+        </w:numPr>
+      </w:pPr>
+      <w:r>
+        <w:rPr>
+          <w:rStyle w:val="Strong"/>
+          <w:rFonts w:eastAsiaTheme="majorEastAsia"/>
+        </w:rPr>
+        <w:t xml:space="preserve">The entire gain is one category: </w:t>
+      </w:r>
+      <w:proofErr w:type="spellStart"/>
+      <w:r>
+        <w:rPr>
+          <w:rStyle w:val="Strong"/>
+          <w:rFonts w:eastAsiaTheme="majorEastAsia"/>
+        </w:rPr>
+        <w:t>patient_style</w:t>
+      </w:r>
+      <w:proofErr w:type="spellEnd"/>
+      <w:r>
+        <w:rPr>
+          <w:rStyle w:val="Strong"/>
+          <w:rFonts w:eastAsiaTheme="majorEastAsia"/>
+        </w:rPr>
+        <w:t>, +16.7 points (0.833 → 1.000).</w:t>
+      </w:r>
+      <w:r>
+        <w:t xml:space="preserve"> Look at the per-category column — every other category is </w:t>
+      </w:r>
+      <w:r>
+        <w:rPr>
+          <w:rStyle w:val="Emphasis"/>
+          <w:rFonts w:eastAsiaTheme="majorEastAsia"/>
+        </w:rPr>
+        <w:t>exactly flat</w:t>
+      </w:r>
+      <w:r>
+        <w:t xml:space="preserve"> (+0.000). This is the cleanest possible confirmation of the mechanism. Query expansion bridges lay vocabulary to clinical vocabulary, so it helps </w:t>
+      </w:r>
+      <w:r>
+        <w:rPr>
+          <w:rStyle w:val="Emphasis"/>
+          <w:rFonts w:eastAsiaTheme="majorEastAsia"/>
+        </w:rPr>
+        <w:t>only</w:t>
+      </w:r>
+      <w:r>
+        <w:t xml:space="preserve"> the queries phrased in lay </w:t>
+      </w:r>
+      <w:proofErr w:type="gramStart"/>
+      <w:r>
+        <w:t>terms, and</w:t>
+      </w:r>
+      <w:proofErr w:type="gramEnd"/>
+      <w:r>
+        <w:t xml:space="preserve"> does nothing everywhere else. The specific query that flipped is PT-005 ("Can I take ozanimod if I have heart problems?") — in the no-router run it went 0→1, because "heart problems" expanded to "cardiac/bradycardia" and pulled in the right chunk. That's the expansion working exactly as designed, traceable to a single query.</w:t>
+      </w:r>
+    </w:p>
+    <w:p>
+      <w:pPr>
+        <w:pStyle w:val="font-claude-response-body"/>
+        <w:numPr>
+          <w:ilvl w:val="0"/>
+          <w:numId w:val="20"/>
+        </w:numPr>
+      </w:pPr>
+      <w:r>
+        <w:rPr>
+          <w:rStyle w:val="Strong"/>
+          <w:rFonts w:eastAsiaTheme="majorEastAsia"/>
+        </w:rPr>
+        <w:t>Contraindications (0.429) and indications (0.333) did not move at all.</w:t>
+      </w:r>
+      <w:r>
+        <w:t xml:space="preserve"> Exactly as predicted. These fail from cross-drug section collision, not vocabulary mismatch — expansion can't fix them, and Option B is what targets them. Your experiment just </w:t>
+      </w:r>
+      <w:r>
+        <w:rPr>
+          <w:rStyle w:val="Emphasis"/>
+          <w:rFonts w:eastAsiaTheme="majorEastAsia"/>
+        </w:rPr>
+        <w:t>empirically demonstrated</w:t>
+      </w:r>
+      <w:r>
+        <w:t xml:space="preserve"> that these two failure modes are distinct, which is a real methodological point for the paper: you can show that a vocabulary intervention leaves the section-collision categories untouched, isolating the two problems.</w:t>
+      </w:r>
+    </w:p>
+    <w:p>
+      <w:pPr>
+        <w:pStyle w:val="font-claude-response-body"/>
+        <w:numPr>
+          <w:ilvl w:val="0"/>
+          <w:numId w:val="20"/>
+        </w:numPr>
+      </w:pPr>
+      <w:proofErr w:type="spellStart"/>
+      <w:r>
+        <w:rPr>
+          <w:rStyle w:val="Strong"/>
+          <w:rFonts w:eastAsiaTheme="majorEastAsia"/>
+        </w:rPr>
+        <w:t>nDCG</w:t>
+      </w:r>
+      <w:proofErr w:type="spellEnd"/>
+      <w:r>
+        <w:rPr>
+          <w:rStyle w:val="Strong"/>
+          <w:rFonts w:eastAsiaTheme="majorEastAsia"/>
+        </w:rPr>
+        <w:t xml:space="preserve"> dipped -1.3 points (0.9626 → 0.9495).</w:t>
+      </w:r>
+      <w:r>
+        <w:t xml:space="preserve"> Minor and expected — expansion adds terms that can slightly reshuffle ranking even when the right chunk is still in the </w:t>
+      </w:r>
+      <w:proofErr w:type="gramStart"/>
+      <w:r>
+        <w:t>top-5</w:t>
+      </w:r>
+      <w:proofErr w:type="gramEnd"/>
+      <w:r>
+        <w:t xml:space="preserve">. Recall (is it in </w:t>
+      </w:r>
+      <w:proofErr w:type="gramStart"/>
+      <w:r>
+        <w:t>top-5</w:t>
+      </w:r>
+      <w:proofErr w:type="gramEnd"/>
+      <w:r>
+        <w:t xml:space="preserve">?) went up; </w:t>
+      </w:r>
+      <w:proofErr w:type="spellStart"/>
+      <w:r>
+        <w:t>nDCG</w:t>
+      </w:r>
+      <w:proofErr w:type="spellEnd"/>
+      <w:r>
+        <w:t xml:space="preserve"> (is it ranked optimally?) went marginally down. Not concerning; worth one sentence noting expansion trades a little ranking precision for a little recall.</w:t>
+      </w:r>
+    </w:p>
+    <w:p>
+      <w:pPr>
+        <w:pStyle w:val="font-claude-response-body"/>
+        <w:numPr>
+          <w:ilvl w:val="0"/>
+          <w:numId w:val="20"/>
+        </w:numPr>
+      </w:pPr>
+      <w:r>
+        <w:rPr>
+          <w:rStyle w:val="Strong"/>
+          <w:rFonts w:eastAsiaTheme="majorEastAsia"/>
+        </w:rPr>
+        <w:t>Downstream (</w:t>
+      </w:r>
+      <w:proofErr w:type="spellStart"/>
+      <w:r>
+        <w:rPr>
+          <w:rStyle w:val="Strong"/>
+          <w:rFonts w:eastAsiaTheme="majorEastAsia"/>
+        </w:rPr>
+        <w:t>groundedness</w:t>
+      </w:r>
+      <w:proofErr w:type="spellEnd"/>
+      <w:r>
+        <w:rPr>
+          <w:rStyle w:val="Strong"/>
+          <w:rFonts w:eastAsiaTheme="majorEastAsia"/>
+        </w:rPr>
+        <w:t xml:space="preserve"> +0.6, refusal +1.2) essentially flat.</w:t>
+      </w:r>
+      <w:r>
+        <w:t xml:space="preserve"> Correct — expansion touches retrieval only, so downstream should barely move. The small refusal bump (</w:t>
+      </w:r>
+      <w:proofErr w:type="spellStart"/>
+      <w:r>
+        <w:t>in_scope</w:t>
+      </w:r>
+      <w:proofErr w:type="spellEnd"/>
+      <w:r>
+        <w:t xml:space="preserve"> 40→41) follows from the one extra query now retrieving evidence. Consistent, no surprises.</w:t>
+      </w:r>
+    </w:p>
+    <w:p>
+      <w:pPr>
+        <w:pStyle w:val="font-claude-response-body"/>
+        <w:numPr>
+          <w:ilvl w:val="0"/>
+          <w:numId w:val="20"/>
+        </w:numPr>
+      </w:pPr>
+      <w:r>
+        <w:rPr>
+          <w:rStyle w:val="Strong"/>
+          <w:rFonts w:eastAsiaTheme="majorEastAsia"/>
+        </w:rPr>
+        <w:t>One thing to notice for honesty:</w:t>
+      </w:r>
+      <w:r>
+        <w:t xml:space="preserve"> with routing, CI-003 </w:t>
+      </w:r>
+      <w:proofErr w:type="gramStart"/>
+      <w:r>
+        <w:t xml:space="preserve">actually </w:t>
+      </w:r>
+      <w:r>
+        <w:rPr>
+          <w:rStyle w:val="Emphasis"/>
+          <w:rFonts w:eastAsiaTheme="majorEastAsia"/>
+        </w:rPr>
+        <w:t>regressed</w:t>
+      </w:r>
+      <w:proofErr w:type="gramEnd"/>
+      <w:r>
+        <w:t xml:space="preserve"> (1→0) while CI-004 improved (0→1) — expansion isn't strictly monotonic per-query, it shuffles some wins and losses. Net still positive, but for the paper you'd report the </w:t>
+      </w:r>
+      <w:r>
+        <w:rPr>
+          <w:rStyle w:val="Emphasis"/>
+          <w:rFonts w:eastAsiaTheme="majorEastAsia"/>
+        </w:rPr>
+        <w:t>net</w:t>
+      </w:r>
+      <w:r>
+        <w:t xml:space="preserve"> effect and acknowledge expansion is not uniformly beneficial at the query level. That's a more credible claim than "expansion helps everything."</w:t>
+      </w:r>
+    </w:p>
+    <w:p>
+      <w:pPr>
+        <w:pStyle w:val="font-claude-response-body"/>
+        <w:numPr>
+          <w:ilvl w:val="0"/>
+          <w:numId w:val="20"/>
+        </w:numPr>
+      </w:pPr>
+      <w:r>
+        <w:rPr>
+          <w:rStyle w:val="Strong"/>
+          <w:rFonts w:eastAsiaTheme="majorEastAsia"/>
+        </w:rPr>
+        <w:lastRenderedPageBreak/>
+        <w:t>Verdict on Option A:</w:t>
+      </w:r>
+      <w:r>
+        <w:t xml:space="preserve"> modest net positive (+1.7 Recall@5), concentrated entirely in lay-phrased queries, zero effect on the structural weak categories. This is a legitimate, publishable finding — arguably a </w:t>
+      </w:r>
+      <w:r>
+        <w:rPr>
+          <w:rStyle w:val="Emphasis"/>
+          <w:rFonts w:eastAsiaTheme="majorEastAsia"/>
+        </w:rPr>
+        <w:t>better</w:t>
+      </w:r>
+      <w:r>
+        <w:t xml:space="preserve"> result for the paper than a large gain, because it cleanly separates vocabulary-mismatch failures from section-collision failures and motivates why you need the heavier interventions.</w:t>
+      </w:r>
+    </w:p>
+    <w:p>
+      <w:pPr>
+        <w:pStyle w:val="font-claude-response-body"/>
+        <w:numPr>
+          <w:ilvl w:val="0"/>
+          <w:numId w:val="20"/>
+        </w:numPr>
+      </w:pPr>
+      <w:r>
+        <w:rPr>
+          <w:rStyle w:val="Strong"/>
+          <w:rFonts w:eastAsiaTheme="majorEastAsia"/>
+        </w:rPr>
+        <w:t>Recommendation: keep Option A as a reported result, but don't rely on it as your main lever.</w:t>
+      </w:r>
+      <w:r>
+        <w:t xml:space="preserve"> For the paper's comparison </w:t>
+      </w:r>
+      <w:proofErr w:type="gramStart"/>
+      <w:r>
+        <w:t>table</w:t>
+      </w:r>
+      <w:proofErr w:type="gramEnd"/>
+      <w:r>
+        <w:t xml:space="preserve"> it's row one: "Query expansion: +1.7 Recall@5, isolated to </w:t>
+      </w:r>
+      <w:proofErr w:type="spellStart"/>
+      <w:r>
+        <w:t>patient_style</w:t>
+      </w:r>
+      <w:proofErr w:type="spellEnd"/>
+      <w:r>
+        <w:t>." Then Option B is where the contraindications/indications story gets addressed.</w:t>
+      </w:r>
+    </w:p>
+    <w:p>
+      <w:pPr>
+        <w:pStyle w:val="p2"/>
+      </w:pPr>
+      <w:r>
+        <w:t xml:space="preserve">Option A (query expansion): net +1.7 Recall@5, +1.7 gold-chunk, −1.3 </w:t>
+      </w:r>
+      <w:proofErr w:type="spellStart"/>
+      <w:r>
+        <w:t>nDCG</w:t>
+      </w:r>
+      <w:proofErr w:type="spellEnd"/>
+      <w:r>
+        <w:t xml:space="preserve">. Gain entirely in </w:t>
+      </w:r>
+      <w:proofErr w:type="spellStart"/>
+      <w:r>
+        <w:t>patient_style</w:t>
+      </w:r>
+      <w:proofErr w:type="spellEnd"/>
+      <w:r>
+        <w:t xml:space="preserve"> (+16.7</w:t>
+      </w:r>
+      <w:proofErr w:type="gramStart"/>
+      <w:r>
+        <w:t>);</w:t>
+      </w:r>
+      <w:proofErr w:type="gramEnd"/>
+      <w:r>
+        <w:t xml:space="preserve"> all other categories flat. Demonstrates vocabulary-bridging helps lay-phrased queries but does not address cross-drug section collision.</w:t>
+      </w:r>
+    </w:p>
+    <w:p>
+      <w:pPr>
+        <w:pStyle w:val="p2"/>
+      </w:pPr>
+    </w:p>
+    <w:p>
+      <w:pPr>
+        <w:pStyle w:val="font-claude-response-body"/>
+      </w:pPr>
+      <w:r>
+        <w:rPr>
+          <w:rStyle w:val="Strong"/>
+          <w:rFonts w:eastAsiaTheme="majorEastAsia"/>
+        </w:rPr>
+        <w:t xml:space="preserve">Aggregate Recall@5: +3.4 points (0.7069 → 0.7414) — the biggest single-option retrieval </w:t>
+      </w:r>
+      <w:proofErr w:type="gramStart"/>
+      <w:r>
+        <w:rPr>
+          <w:rStyle w:val="Strong"/>
+          <w:rFonts w:eastAsiaTheme="majorEastAsia"/>
+        </w:rPr>
+        <w:t>gain</w:t>
+      </w:r>
+      <w:proofErr w:type="gramEnd"/>
+      <w:r>
+        <w:rPr>
+          <w:rStyle w:val="Strong"/>
+          <w:rFonts w:eastAsiaTheme="majorEastAsia"/>
+        </w:rPr>
+        <w:t xml:space="preserve"> so far.</w:t>
+      </w:r>
+      <w:r>
+        <w:t xml:space="preserve"> </w:t>
+      </w:r>
+      <w:proofErr w:type="gramStart"/>
+      <w:r>
+        <w:t>So</w:t>
+      </w:r>
+      <w:proofErr w:type="gramEnd"/>
+      <w:r>
+        <w:t xml:space="preserve"> context embeddings did help overall, more than Option A's +1.7. But </w:t>
+      </w:r>
+      <w:r>
+        <w:rPr>
+          <w:rStyle w:val="Emphasis"/>
+          <w:rFonts w:eastAsiaTheme="majorEastAsia"/>
+        </w:rPr>
+        <w:t>where</w:t>
+      </w:r>
+      <w:r>
+        <w:t xml:space="preserve"> it helped is the opposite of what I predicted:</w:t>
+      </w:r>
+    </w:p>
+    <w:p>
+      <w:pPr>
+        <w:pStyle w:val="font-claude-response-body"/>
+        <w:numPr>
+          <w:ilvl w:val="0"/>
+          <w:numId w:val="22"/>
+        </w:numPr>
+      </w:pPr>
+      <w:proofErr w:type="spellStart"/>
+      <w:r>
+        <w:rPr>
+          <w:rStyle w:val="Strong"/>
+          <w:rFonts w:eastAsiaTheme="majorEastAsia"/>
+        </w:rPr>
+        <w:t>adverse_reactions</w:t>
+      </w:r>
+      <w:proofErr w:type="spellEnd"/>
+      <w:r>
+        <w:rPr>
+          <w:rStyle w:val="Strong"/>
+          <w:rFonts w:eastAsiaTheme="majorEastAsia"/>
+        </w:rPr>
+        <w:t xml:space="preserve"> +12.5 (0.750 → 0.875)</w:t>
+      </w:r>
+      <w:r>
+        <w:t xml:space="preserve"> and </w:t>
+      </w:r>
+      <w:r>
+        <w:rPr>
+          <w:rStyle w:val="Strong"/>
+          <w:rFonts w:eastAsiaTheme="majorEastAsia"/>
+        </w:rPr>
+        <w:t>dosing +16.7 (0.500 → 0.667)</w:t>
+      </w:r>
+      <w:r>
+        <w:t xml:space="preserve"> — these are the two movers.</w:t>
+      </w:r>
+    </w:p>
+    <w:p>
+      <w:pPr>
+        <w:pStyle w:val="font-claude-response-body"/>
+        <w:numPr>
+          <w:ilvl w:val="0"/>
+          <w:numId w:val="22"/>
+        </w:numPr>
+      </w:pPr>
+      <w:r>
+        <w:rPr>
+          <w:rStyle w:val="Strong"/>
+          <w:rFonts w:eastAsiaTheme="majorEastAsia"/>
+        </w:rPr>
+        <w:t>contraindications and indications: exactly zero.</w:t>
+      </w:r>
+    </w:p>
+    <w:p>
+      <w:pPr>
+        <w:pStyle w:val="font-claude-response-body"/>
+      </w:pPr>
+      <w:r>
+        <w:t xml:space="preserve">Think about why. Adverse reactions and dosing are long, content-rich sections where the drug-specific text is already distinctive — prepending "Drug: X | Section: dosage and administration" nudged a couple of near-miss chunks into the </w:t>
+      </w:r>
+      <w:proofErr w:type="gramStart"/>
+      <w:r>
+        <w:t>top-5</w:t>
+      </w:r>
+      <w:proofErr w:type="gramEnd"/>
+      <w:r>
+        <w:t xml:space="preserve">. But contraindications and indications fail for a </w:t>
+      </w:r>
+      <w:r>
+        <w:rPr>
+          <w:rStyle w:val="Emphasis"/>
+          <w:rFonts w:eastAsiaTheme="majorEastAsia"/>
+        </w:rPr>
+        <w:t>structural</w:t>
+      </w:r>
+      <w:r>
+        <w:t xml:space="preserve"> reason context-prefixing can't fix: for indications, every MS drug's chunk literally says "relapsing forms of multiple sclerosis" — the sections are near-identical </w:t>
+      </w:r>
+      <w:r>
+        <w:rPr>
+          <w:rStyle w:val="Emphasis"/>
+          <w:rFonts w:eastAsiaTheme="majorEastAsia"/>
+        </w:rPr>
+        <w:t>even after</w:t>
+      </w:r>
+      <w:r>
+        <w:t xml:space="preserve"> you prepend the drug name, because the query "What is ocrelizumab approved to treat?" doesn't carry enough drug-distinctive signal to separate ocrelizumab's near-identical indication chunk from ten others. Prepending the drug name to the </w:t>
+      </w:r>
+      <w:r>
+        <w:rPr>
+          <w:rStyle w:val="Emphasis"/>
+          <w:rFonts w:eastAsiaTheme="majorEastAsia"/>
+        </w:rPr>
+        <w:t>chunk</w:t>
+      </w:r>
+      <w:r>
+        <w:t xml:space="preserve"> doesn't help if the </w:t>
+      </w:r>
+      <w:r>
+        <w:rPr>
+          <w:rStyle w:val="Emphasis"/>
+          <w:rFonts w:eastAsiaTheme="majorEastAsia"/>
+        </w:rPr>
+        <w:t>query</w:t>
+      </w:r>
+      <w:r>
+        <w:t xml:space="preserve"> embedding can't lean on it (this is the asymmetry I flagged — B2 prefixes chunks only). For contraindications, the "None." labels and generic hypersensitivity boilerplate dominate regardless of prefix.</w:t>
+      </w:r>
+    </w:p>
+    <w:p>
+      <w:pPr>
+        <w:pStyle w:val="font-claude-response-body"/>
+      </w:pPr>
+      <w:proofErr w:type="gramStart"/>
+      <w:r>
+        <w:t>So</w:t>
+      </w:r>
+      <w:proofErr w:type="gramEnd"/>
+      <w:r>
+        <w:t xml:space="preserve"> the honest finding: </w:t>
+      </w:r>
+      <w:r>
+        <w:rPr>
+          <w:rStyle w:val="Strong"/>
+          <w:rFonts w:eastAsiaTheme="majorEastAsia"/>
+        </w:rPr>
+        <w:t>context-enriched embeddings help distinctive-content sections (AE, dosing) but do NOT resolve cross-drug near-duplicate sections (indications, contraindications).</w:t>
+      </w:r>
+      <w:r>
+        <w:t xml:space="preserve"> That's a real, specific, publishable result — and it </w:t>
+      </w:r>
+      <w:r>
+        <w:rPr>
+          <w:rStyle w:val="Emphasis"/>
+          <w:rFonts w:eastAsiaTheme="majorEastAsia"/>
+        </w:rPr>
+        <w:t>narrows</w:t>
+      </w:r>
+      <w:r>
+        <w:t xml:space="preserve"> the diagnosis. The two stubborn categories aren't an embedding problem at all. They're a problem that needs either the query side to carry drug/section identity (symmetric prefixing, B1) or a </w:t>
+      </w:r>
+      <w:proofErr w:type="spellStart"/>
+      <w:r>
+        <w:t>reranker</w:t>
+      </w:r>
+      <w:proofErr w:type="spellEnd"/>
+      <w:r>
+        <w:t xml:space="preserve"> that scores the actual query-chunk pair (Option C).</w:t>
+      </w:r>
+    </w:p>
+    <w:p>
+      <w:pPr>
+        <w:pStyle w:val="font-claude-response-body"/>
+      </w:pPr>
+      <w:r>
+        <w:rPr>
+          <w:rStyle w:val="Strong"/>
+          <w:rFonts w:eastAsiaTheme="majorEastAsia"/>
+        </w:rPr>
+        <w:t>The trade-off you must report — gold-chunk Recall went DOWN −3.4 (0.4483 → 0.4138) while alias-Recall went UP.</w:t>
+      </w:r>
+      <w:r>
+        <w:t xml:space="preserve"> This is the most interesting number in the </w:t>
+      </w:r>
+      <w:proofErr w:type="gramStart"/>
+      <w:r>
+        <w:t>run</w:t>
+      </w:r>
+      <w:proofErr w:type="gramEnd"/>
+      <w:r>
+        <w:t xml:space="preserve"> and you can't skip it. It </w:t>
+      </w:r>
+      <w:proofErr w:type="gramStart"/>
+      <w:r>
+        <w:t>means:</w:t>
+      </w:r>
+      <w:proofErr w:type="gramEnd"/>
+      <w:r>
+        <w:t xml:space="preserve"> context prefixing retrieved </w:t>
+      </w:r>
+      <w:r>
+        <w:rPr>
+          <w:rStyle w:val="Emphasis"/>
+          <w:rFonts w:eastAsiaTheme="majorEastAsia"/>
+        </w:rPr>
+        <w:t>more right-drug-right-section</w:t>
+      </w:r>
+      <w:r>
+        <w:t xml:space="preserve"> chunks (alias up) but </w:t>
+      </w:r>
+      <w:r>
+        <w:rPr>
+          <w:rStyle w:val="Emphasis"/>
+          <w:rFonts w:eastAsiaTheme="majorEastAsia"/>
+        </w:rPr>
+        <w:t>fewer of the exact annotated gold</w:t>
+      </w:r>
+      <w:r>
+        <w:t xml:space="preserve"> chunks (gold down). Mechanically, prepending "Section: adverse </w:t>
+      </w:r>
+      <w:r>
+        <w:lastRenderedPageBreak/>
+        <w:t xml:space="preserve">reactions" makes all adverse-reactions chunks look more alike, so you pull in </w:t>
+      </w:r>
+      <w:r>
+        <w:rPr>
+          <w:rStyle w:val="Emphasis"/>
+          <w:rFonts w:eastAsiaTheme="majorEastAsia"/>
+        </w:rPr>
+        <w:t>a</w:t>
+      </w:r>
+      <w:r>
+        <w:t xml:space="preserve"> correct-section chunk more often, but not necessarily </w:t>
+      </w:r>
+      <w:r>
+        <w:rPr>
+          <w:rStyle w:val="Emphasis"/>
+          <w:rFonts w:eastAsiaTheme="majorEastAsia"/>
+        </w:rPr>
+        <w:t>the specific</w:t>
+      </w:r>
+      <w:r>
+        <w:t xml:space="preserve"> one your annotation marked. dosing shows this starkly: alias-Recall 0.667 but </w:t>
+      </w:r>
+      <w:r>
+        <w:rPr>
+          <w:rStyle w:val="Strong"/>
+          <w:rFonts w:eastAsiaTheme="majorEastAsia"/>
+        </w:rPr>
+        <w:t>gold-chunk 0.000</w:t>
+      </w:r>
+      <w:r>
+        <w:t xml:space="preserve"> — it's finding dosing chunks, but never the exact gold dosing chunk. For a safety QA system this </w:t>
+      </w:r>
+      <w:proofErr w:type="gramStart"/>
+      <w:r>
+        <w:t>matters:</w:t>
+      </w:r>
+      <w:proofErr w:type="gramEnd"/>
+      <w:r>
+        <w:t xml:space="preserve"> retrieving </w:t>
+      </w:r>
+      <w:r>
+        <w:rPr>
+          <w:rStyle w:val="Emphasis"/>
+          <w:rFonts w:eastAsiaTheme="majorEastAsia"/>
+        </w:rPr>
+        <w:t>a</w:t>
+      </w:r>
+      <w:r>
+        <w:t xml:space="preserve"> dosing chunk for the wrong drug-strength or a related-but-not-target passage is exactly the failure your gold-chunk metric was built to catch. </w:t>
+      </w:r>
+      <w:proofErr w:type="gramStart"/>
+      <w:r>
+        <w:t>So</w:t>
+      </w:r>
+      <w:proofErr w:type="gramEnd"/>
+      <w:r>
+        <w:t xml:space="preserve"> Option B trades exact-match precision for looser section-match recall. That's a genuine tension, and reporting both metrics is what makes your evaluation framework a contribution — most papers only report the loose metric and would call B a clean win.</w:t>
+      </w:r>
+    </w:p>
+    <w:p>
+      <w:pPr>
+        <w:pStyle w:val="font-claude-response-body"/>
+      </w:pPr>
+      <w:r>
+        <w:rPr>
+          <w:rStyle w:val="Strong"/>
+          <w:rFonts w:eastAsiaTheme="majorEastAsia"/>
+        </w:rPr>
+        <w:t xml:space="preserve">Refusal nudged up (+2.3, </w:t>
+      </w:r>
+      <w:proofErr w:type="spellStart"/>
+      <w:r>
+        <w:rPr>
+          <w:rStyle w:val="Strong"/>
+          <w:rFonts w:eastAsiaTheme="majorEastAsia"/>
+        </w:rPr>
+        <w:t>near_scope</w:t>
+      </w:r>
+      <w:proofErr w:type="spellEnd"/>
+      <w:r>
+        <w:rPr>
+          <w:rStyle w:val="Strong"/>
+          <w:rFonts w:eastAsiaTheme="majorEastAsia"/>
+        </w:rPr>
+        <w:t xml:space="preserve"> 10→11/12), </w:t>
+      </w:r>
+      <w:proofErr w:type="spellStart"/>
+      <w:r>
+        <w:rPr>
+          <w:rStyle w:val="Strong"/>
+          <w:rFonts w:eastAsiaTheme="majorEastAsia"/>
+        </w:rPr>
+        <w:t>groundedness</w:t>
+      </w:r>
+      <w:proofErr w:type="spellEnd"/>
+      <w:r>
+        <w:rPr>
+          <w:rStyle w:val="Strong"/>
+          <w:rFonts w:eastAsiaTheme="majorEastAsia"/>
+        </w:rPr>
+        <w:t xml:space="preserve"> flat.</w:t>
+      </w:r>
+      <w:r>
+        <w:t xml:space="preserve"> Minor, downstream of the one or two extra in-scope retrievals. Nothing to read into.</w:t>
+      </w:r>
+    </w:p>
+    <w:p>
+      <w:pPr>
+        <w:pStyle w:val="font-claude-response-body"/>
+      </w:pPr>
+      <w:r>
+        <w:t xml:space="preserve">Net verdict on Option B: </w:t>
+      </w:r>
+      <w:r>
+        <w:rPr>
+          <w:rStyle w:val="Strong"/>
+          <w:rFonts w:eastAsiaTheme="majorEastAsia"/>
+        </w:rPr>
+        <w:t>modest aggregate retrieval gain (+3.4 alias-Recall), but with a real precision cost (−3.4 gold-chunk) and zero effect on the two target weak categories.</w:t>
+      </w:r>
+      <w:r>
+        <w:t xml:space="preserve"> It's not the silver bullet I predicted. It's a mixed result — which is a </w:t>
+      </w:r>
+      <w:r>
+        <w:rPr>
+          <w:rStyle w:val="Emphasis"/>
+          <w:rFonts w:eastAsiaTheme="majorEastAsia"/>
+        </w:rPr>
+        <w:t>better</w:t>
+      </w:r>
+      <w:r>
+        <w:t xml:space="preserve"> paper contribution than a clean win, because it demonstrates your two-metric evaluation catching a trade-off a single-metric eval would hide.</w:t>
+      </w:r>
+    </w:p>
+    <w:p>
+      <w:pPr>
+        <w:pStyle w:val="font-claude-response-body"/>
+      </w:pPr>
+      <w:r>
+        <w:t>Record for the comparison table:</w:t>
+      </w:r>
+    </w:p>
+    <w:p>
+      <w:pPr>
+        <w:pStyle w:val="font-claude-response-body"/>
+        <w:numPr>
+          <w:ilvl w:val="0"/>
+          <w:numId w:val="23"/>
+        </w:numPr>
+      </w:pPr>
+      <w:r>
+        <w:t xml:space="preserve">Option B (context embeddings): alias-Recall@5 +3.4, </w:t>
+      </w:r>
+      <w:r>
+        <w:rPr>
+          <w:rStyle w:val="Strong"/>
+          <w:rFonts w:eastAsiaTheme="majorEastAsia"/>
+        </w:rPr>
+        <w:t>gold-chunk Recall@5 −3.4</w:t>
+      </w:r>
+      <w:r>
+        <w:t xml:space="preserve">, </w:t>
+      </w:r>
+      <w:proofErr w:type="spellStart"/>
+      <w:r>
+        <w:t>nDCG</w:t>
+      </w:r>
+      <w:proofErr w:type="spellEnd"/>
+      <w:r>
+        <w:t xml:space="preserve"> −0.4. Gains concentrated in </w:t>
+      </w:r>
+      <w:proofErr w:type="spellStart"/>
+      <w:r>
+        <w:t>adverse_reactions</w:t>
+      </w:r>
+      <w:proofErr w:type="spellEnd"/>
+      <w:r>
+        <w:t xml:space="preserve"> (+12.5) and dosing (+16.7, but gold-chunk 0.0). No effect on contraindications/indications. Finding: context prefixing improves section-level recall for content-rich sections while reducing exact-gold-chunk </w:t>
+      </w:r>
+      <w:proofErr w:type="gramStart"/>
+      <w:r>
+        <w:t>precision, and</w:t>
+      </w:r>
+      <w:proofErr w:type="gramEnd"/>
+      <w:r>
+        <w:t xml:space="preserve"> does not resolve cross-drug near-duplicate sections.</w:t>
+      </w:r>
+    </w:p>
+    <w:p>
+      <w:pPr>
+        <w:pStyle w:val="font-claude-response-body"/>
+      </w:pPr>
+    </w:p>
+    <w:p>
+      <w:pPr>
+        <w:pStyle w:val="font-claude-response-body"/>
+      </w:pPr>
+      <w:r>
+        <w:rPr>
+          <w:rStyle w:val="animating6ta1u10"/>
+          <w:rFonts w:eastAsiaTheme="majorEastAsia"/>
+          <w:b/>
+          <w:bCs/>
+        </w:rPr>
+        <w:t>Baseline index, not stacked on B.</w:t>
+      </w:r>
+      <w:r>
+        <w:rPr>
+          <w:rStyle w:val="animating6ta1u10"/>
+          <w:rFonts w:eastAsiaTheme="majorEastAsia"/>
+        </w:rPr>
+        <w:t xml:space="preserve"> Here's the analysis in the terms you asked for:</w:t>
+      </w:r>
+    </w:p>
+    <w:p>
+      <w:pPr>
+        <w:pStyle w:val="font-claude-response-body"/>
+      </w:pPr>
+      <w:r>
+        <w:rPr>
+          <w:rStyle w:val="animating6ta1u10"/>
+          <w:rFonts w:eastAsiaTheme="majorEastAsia"/>
+        </w:rPr>
+        <w:t xml:space="preserve">For </w:t>
+      </w:r>
+      <w:r>
+        <w:rPr>
+          <w:rStyle w:val="animating6ta1u10"/>
+          <w:rFonts w:eastAsiaTheme="majorEastAsia"/>
+          <w:i/>
+          <w:iCs/>
+        </w:rPr>
+        <w:t>numbers/attribution</w:t>
+      </w:r>
+      <w:r>
+        <w:rPr>
+          <w:rStyle w:val="animating6ta1u10"/>
+          <w:rFonts w:eastAsiaTheme="majorEastAsia"/>
+        </w:rPr>
+        <w:t xml:space="preserve">: stacking C on B means any delta you see is "B+C combined," and you already know B has a mixed profile (−3.4 gold-chunk). You couldn't tell whether C fixed B's precision loss or caused its own effect. On the plain baseline, C's delta is </w:t>
+      </w:r>
+      <w:proofErr w:type="gramStart"/>
+      <w:r>
+        <w:rPr>
+          <w:rStyle w:val="animating6ta1u10"/>
+          <w:rFonts w:eastAsiaTheme="majorEastAsia"/>
+        </w:rPr>
+        <w:t>C's</w:t>
+      </w:r>
+      <w:proofErr w:type="gramEnd"/>
+      <w:r>
+        <w:rPr>
+          <w:rStyle w:val="animating6ta1u10"/>
+          <w:rFonts w:eastAsiaTheme="majorEastAsia"/>
+        </w:rPr>
+        <w:t xml:space="preserve"> alone. Clean.</w:t>
+      </w:r>
+    </w:p>
+    <w:p>
+      <w:pPr>
+        <w:pStyle w:val="font-claude-response-body"/>
+      </w:pPr>
+      <w:r>
+        <w:rPr>
+          <w:rStyle w:val="animating6ta1u10"/>
+          <w:rFonts w:eastAsiaTheme="majorEastAsia"/>
+        </w:rPr>
+        <w:t xml:space="preserve">For </w:t>
+      </w:r>
+      <w:r>
+        <w:rPr>
+          <w:rStyle w:val="animating6ta1u10"/>
+          <w:rFonts w:eastAsiaTheme="majorEastAsia"/>
+          <w:i/>
+          <w:iCs/>
+        </w:rPr>
+        <w:t>final target values</w:t>
+      </w:r>
+      <w:r>
+        <w:rPr>
+          <w:rStyle w:val="animating6ta1u10"/>
+          <w:rFonts w:eastAsiaTheme="majorEastAsia"/>
+        </w:rPr>
+        <w:t xml:space="preserve">: your live targets are Recall@5 ≥0.70 (already met at 0.707) and the unmet </w:t>
+      </w:r>
+      <w:proofErr w:type="spellStart"/>
+      <w:r>
+        <w:rPr>
+          <w:rStyle w:val="animating6ta1u10"/>
+          <w:rFonts w:eastAsiaTheme="majorEastAsia"/>
+        </w:rPr>
+        <w:t>groundedness</w:t>
+      </w:r>
+      <w:proofErr w:type="spellEnd"/>
+      <w:r>
+        <w:rPr>
+          <w:rStyle w:val="animating6ta1u10"/>
+          <w:rFonts w:eastAsiaTheme="majorEastAsia"/>
+        </w:rPr>
+        <w:t xml:space="preserve">/gold-chunk quality. C's job is to lift the </w:t>
+      </w:r>
+      <w:r>
+        <w:rPr>
+          <w:rStyle w:val="animating6ta1u10"/>
+          <w:rFonts w:eastAsiaTheme="majorEastAsia"/>
+          <w:i/>
+          <w:iCs/>
+        </w:rPr>
+        <w:t>precision</w:t>
+      </w:r>
+      <w:r>
+        <w:rPr>
+          <w:rStyle w:val="animating6ta1u10"/>
+          <w:rFonts w:eastAsiaTheme="majorEastAsia"/>
+        </w:rPr>
+        <w:t xml:space="preserve"> metrics — gold-chunk Recall and the weak categories — not aggregate recall. Reranking reorders the top-k so the best chunk rises to the top; it can't add a chunk that retrieval missed entirely. </w:t>
+      </w:r>
+      <w:proofErr w:type="gramStart"/>
+      <w:r>
+        <w:rPr>
+          <w:rStyle w:val="animating6ta1u10"/>
+          <w:rFonts w:eastAsiaTheme="majorEastAsia"/>
+        </w:rPr>
+        <w:t>So</w:t>
+      </w:r>
+      <w:proofErr w:type="gramEnd"/>
+      <w:r>
+        <w:rPr>
+          <w:rStyle w:val="animating6ta1u10"/>
+          <w:rFonts w:eastAsiaTheme="majorEastAsia"/>
+        </w:rPr>
+        <w:t xml:space="preserve"> watch gold-chunk Recall and contraindications/indications, not headline Recall@5.</w:t>
+      </w:r>
+    </w:p>
+    <w:p>
+      <w:pPr>
+        <w:pStyle w:val="font-claude-response-body"/>
+      </w:pPr>
+      <w:r>
+        <w:rPr>
+          <w:rStyle w:val="animating6ta1u10"/>
+          <w:rFonts w:eastAsiaTheme="majorEastAsia"/>
+        </w:rPr>
+        <w:t xml:space="preserve">For </w:t>
+      </w:r>
+      <w:r>
+        <w:rPr>
+          <w:rStyle w:val="animating6ta1u10"/>
+          <w:rFonts w:eastAsiaTheme="majorEastAsia"/>
+          <w:i/>
+          <w:iCs/>
+        </w:rPr>
+        <w:t>the paper</w:t>
+      </w:r>
+      <w:r>
+        <w:rPr>
+          <w:rStyle w:val="animating6ta1u10"/>
+          <w:rFonts w:eastAsiaTheme="majorEastAsia"/>
+        </w:rPr>
+        <w:t xml:space="preserve">: the cleanest story is a table where each option is measured against one frozen baseline — "A: +1.7, B: +3.4/−3.4, C: +X" — all independently attributable. If C is stacked on B, that row breaks the table's logic and a reviewer flags it. Independent-vs-baseline is the defensible design, and it's the one that lets you later say "B and C are complementary, we also </w:t>
+      </w:r>
+      <w:r>
+        <w:rPr>
+          <w:rStyle w:val="animating6ta1u10"/>
+          <w:rFonts w:eastAsiaTheme="majorEastAsia"/>
+        </w:rPr>
+        <w:lastRenderedPageBreak/>
+        <w:t xml:space="preserve">tested them combined" as a </w:t>
+      </w:r>
+      <w:r>
+        <w:rPr>
+          <w:rStyle w:val="animating6ta1u10"/>
+          <w:rFonts w:eastAsiaTheme="majorEastAsia"/>
+          <w:i/>
+          <w:iCs/>
+        </w:rPr>
+        <w:t>separate</w:t>
+      </w:r>
+      <w:r>
+        <w:rPr>
+          <w:rStyle w:val="animating6ta1u10"/>
+          <w:rFonts w:eastAsiaTheme="majorEastAsia"/>
+        </w:rPr>
+        <w:t xml:space="preserve"> row if you want. You've already restored the baseline index, so you're set up for exactly this.</w:t>
+      </w:r>
+    </w:p>
+    <w:p>
+      <w:pPr>
+        <w:pStyle w:val="font-claude-response-body"/>
+      </w:pPr>
+      <w:r>
+        <w:rPr>
+          <w:rStyle w:val="animating6ta1u10"/>
+          <w:rFonts w:eastAsiaTheme="majorEastAsia"/>
+        </w:rPr>
+        <w:t xml:space="preserve">One important expectation to set: </w:t>
+      </w:r>
+      <w:r>
+        <w:rPr>
+          <w:rStyle w:val="animating6ta1u10"/>
+          <w:rFonts w:eastAsiaTheme="majorEastAsia"/>
+          <w:b/>
+          <w:bCs/>
+        </w:rPr>
+        <w:t xml:space="preserve">a </w:t>
+      </w:r>
+      <w:proofErr w:type="spellStart"/>
+      <w:r>
+        <w:rPr>
+          <w:rStyle w:val="animating6ta1u10"/>
+          <w:rFonts w:eastAsiaTheme="majorEastAsia"/>
+          <w:b/>
+          <w:bCs/>
+        </w:rPr>
+        <w:t>reranker</w:t>
+      </w:r>
+      <w:proofErr w:type="spellEnd"/>
+      <w:r>
+        <w:rPr>
+          <w:rStyle w:val="animating6ta1u10"/>
+          <w:rFonts w:eastAsiaTheme="majorEastAsia"/>
+          <w:b/>
+          <w:bCs/>
+        </w:rPr>
+        <w:t xml:space="preserve"> cannot rescue a query where the gold chunk isn't in the retrieved candidate set.</w:t>
+      </w:r>
+      <w:r>
+        <w:rPr>
+          <w:rStyle w:val="animating6ta1u10"/>
+          <w:rFonts w:eastAsiaTheme="majorEastAsia"/>
+        </w:rPr>
+        <w:t xml:space="preserve"> For IU-004 (ofatumumab) where retrieval returns nothing relevant, reranking the top-k won't help — you can only reorder what was retrieved. </w:t>
+      </w:r>
+      <w:proofErr w:type="gramStart"/>
+      <w:r>
+        <w:rPr>
+          <w:rStyle w:val="animating6ta1u10"/>
+          <w:rFonts w:eastAsiaTheme="majorEastAsia"/>
+        </w:rPr>
+        <w:t>So</w:t>
+      </w:r>
+      <w:proofErr w:type="gramEnd"/>
+      <w:r>
+        <w:rPr>
+          <w:rStyle w:val="animating6ta1u10"/>
+          <w:rFonts w:eastAsiaTheme="majorEastAsia"/>
+        </w:rPr>
+        <w:t xml:space="preserve"> retrieve a </w:t>
+      </w:r>
+      <w:r>
+        <w:rPr>
+          <w:rStyle w:val="animating6ta1u10"/>
+          <w:rFonts w:eastAsiaTheme="majorEastAsia"/>
+          <w:i/>
+          <w:iCs/>
+        </w:rPr>
+        <w:t>wider</w:t>
+      </w:r>
+      <w:r>
+        <w:rPr>
+          <w:rStyle w:val="animating6ta1u10"/>
+          <w:rFonts w:eastAsiaTheme="majorEastAsia"/>
+        </w:rPr>
+        <w:t xml:space="preserve"> candidate pool (</w:t>
+      </w:r>
+      <w:proofErr w:type="gramStart"/>
+      <w:r>
+        <w:rPr>
+          <w:rStyle w:val="animating6ta1u10"/>
+          <w:rFonts w:eastAsiaTheme="majorEastAsia"/>
+        </w:rPr>
+        <w:t>top-20</w:t>
+      </w:r>
+      <w:proofErr w:type="gramEnd"/>
+      <w:r>
+        <w:rPr>
+          <w:rStyle w:val="animating6ta1u10"/>
+          <w:rFonts w:eastAsiaTheme="majorEastAsia"/>
+        </w:rPr>
+        <w:t xml:space="preserve">) and </w:t>
+      </w:r>
+      <w:proofErr w:type="spellStart"/>
+      <w:r>
+        <w:rPr>
+          <w:rStyle w:val="animating6ta1u10"/>
+          <w:rFonts w:eastAsiaTheme="majorEastAsia"/>
+        </w:rPr>
+        <w:t>rerank</w:t>
+      </w:r>
+      <w:proofErr w:type="spellEnd"/>
+      <w:r>
+        <w:rPr>
+          <w:rStyle w:val="animating6ta1u10"/>
+          <w:rFonts w:eastAsiaTheme="majorEastAsia"/>
+        </w:rPr>
+        <w:t xml:space="preserve"> down to 5. That gives the </w:t>
+      </w:r>
+      <w:proofErr w:type="spellStart"/>
+      <w:r>
+        <w:rPr>
+          <w:rStyle w:val="animating6ta1u10"/>
+          <w:rFonts w:eastAsiaTheme="majorEastAsia"/>
+        </w:rPr>
+        <w:t>reranker</w:t>
+      </w:r>
+      <w:proofErr w:type="spellEnd"/>
+      <w:r>
+        <w:rPr>
+          <w:rStyle w:val="animating6ta1u10"/>
+          <w:rFonts w:eastAsiaTheme="majorEastAsia"/>
+        </w:rPr>
+        <w:t xml:space="preserve"> room to promote a gold chunk that was sitting at rank 8 into the final </w:t>
+      </w:r>
+      <w:proofErr w:type="gramStart"/>
+      <w:r>
+        <w:rPr>
+          <w:rStyle w:val="animating6ta1u10"/>
+          <w:rFonts w:eastAsiaTheme="majorEastAsia"/>
+        </w:rPr>
+        <w:t>top-5</w:t>
+      </w:r>
+      <w:proofErr w:type="gramEnd"/>
+      <w:r>
+        <w:rPr>
+          <w:rStyle w:val="animating6ta1u10"/>
+          <w:rFonts w:eastAsiaTheme="majorEastAsia"/>
+        </w:rPr>
+        <w:t>. This is the key design choice that makes C worth doing.</w:t>
+      </w:r>
+    </w:p>
+    <w:p>
+      <w:pPr>
+        <w:pStyle w:val="font-claude-response-body"/>
+      </w:pPr>
+      <w:r>
+        <w:t xml:space="preserve">Two design points worth noting for the paper: reranking uses the </w:t>
+      </w:r>
+      <w:r>
+        <w:rPr>
+          <w:rStyle w:val="Strong"/>
+          <w:rFonts w:eastAsiaTheme="majorEastAsia"/>
+        </w:rPr>
+        <w:t>original</w:t>
+      </w:r>
+      <w:r>
+        <w:t xml:space="preserve"> query text (not the expanded one) because the cross-encoder reads natural language pairs; and it </w:t>
+      </w:r>
+      <w:proofErr w:type="spellStart"/>
+      <w:r>
+        <w:t>reranks</w:t>
+      </w:r>
+      <w:proofErr w:type="spellEnd"/>
+      <w:r>
+        <w:t xml:space="preserve"> the merged </w:t>
+      </w:r>
+      <w:proofErr w:type="spellStart"/>
+      <w:r>
+        <w:t>filtered+unfiltered</w:t>
+      </w:r>
+      <w:proofErr w:type="spellEnd"/>
+      <w:r>
+        <w:t xml:space="preserve"> pool, so routing and reranking compose rather than conflict.</w:t>
+      </w:r>
+    </w:p>
+    <w:p>
+      <w:pPr>
+        <w:pStyle w:val="font-claude-response-body"/>
+      </w:pPr>
+      <w:r>
+        <w:rPr>
+          <w:rStyle w:val="animating6ta1u10"/>
+          <w:rFonts w:eastAsiaTheme="majorEastAsia"/>
+          <w:b/>
+          <w:bCs/>
+        </w:rPr>
+        <w:t>Gold-chunk Recall: 0.4483 → 0.6034 (+15.5 points).</w:t>
+      </w:r>
+      <w:r>
+        <w:rPr>
+          <w:rStyle w:val="animating6ta1u10"/>
+          <w:rFonts w:eastAsiaTheme="majorEastAsia"/>
+        </w:rPr>
+        <w:t xml:space="preserve"> This is the headline. Reranking recovered the exact-gold-chunk precision that embedding similarity alone couldn't reach — and it's the metric that matters most for safety QA, because it measures "did we retrieve </w:t>
+      </w:r>
+      <w:r>
+        <w:rPr>
+          <w:rStyle w:val="animating6ta1u10"/>
+          <w:rFonts w:eastAsiaTheme="majorEastAsia"/>
+          <w:i/>
+          <w:iCs/>
+        </w:rPr>
+        <w:t>the specific</w:t>
+      </w:r>
+      <w:r>
+        <w:rPr>
+          <w:rStyle w:val="animating6ta1u10"/>
+          <w:rFonts w:eastAsiaTheme="majorEastAsia"/>
+        </w:rPr>
+        <w:t xml:space="preserve"> correct evidence," not "did we retrieve </w:t>
+      </w:r>
+      <w:r>
+        <w:rPr>
+          <w:rStyle w:val="animating6ta1u10"/>
+          <w:rFonts w:eastAsiaTheme="majorEastAsia"/>
+          <w:i/>
+          <w:iCs/>
+        </w:rPr>
+        <w:t>something</w:t>
+      </w:r>
+      <w:r>
+        <w:rPr>
+          <w:rStyle w:val="animating6ta1u10"/>
+          <w:rFonts w:eastAsiaTheme="majorEastAsia"/>
+        </w:rPr>
+        <w:t xml:space="preserve"> from the right area." A +15.5 jump on your strictest metric is the strongest single result in the entire experiment series.</w:t>
+      </w:r>
+    </w:p>
+    <w:p>
+      <w:pPr>
+        <w:pStyle w:val="font-claude-response-body"/>
+      </w:pPr>
+      <w:r>
+        <w:rPr>
+          <w:rStyle w:val="animating6ta1u10"/>
+          <w:rFonts w:eastAsiaTheme="majorEastAsia"/>
+          <w:b/>
+          <w:bCs/>
+        </w:rPr>
+        <w:t>Alias Recall@5: 0.7069 → 0.8448 (+13.8 points).</w:t>
+      </w:r>
+      <w:r>
+        <w:rPr>
+          <w:rStyle w:val="animating6ta1u10"/>
+          <w:rFonts w:eastAsiaTheme="majorEastAsia"/>
+        </w:rPr>
+        <w:t xml:space="preserve"> Blew past target. For context, Option A gave +1.7 and Option B gave +3.4. C gives +13.8 — an order of magnitude larger. The wide-pool-plus-</w:t>
+      </w:r>
+      <w:proofErr w:type="spellStart"/>
+      <w:r>
+        <w:rPr>
+          <w:rStyle w:val="animating6ta1u10"/>
+          <w:rFonts w:eastAsiaTheme="majorEastAsia"/>
+        </w:rPr>
+        <w:t>rerank</w:t>
+      </w:r>
+      <w:proofErr w:type="spellEnd"/>
+      <w:r>
+        <w:rPr>
+          <w:rStyle w:val="animating6ta1u10"/>
+          <w:rFonts w:eastAsiaTheme="majorEastAsia"/>
+        </w:rPr>
+        <w:t xml:space="preserve"> design (retrieve 20, cross-encode down to 5) is doing exactly what it was supposed to.</w:t>
+      </w:r>
+    </w:p>
+    <w:p>
+      <w:pPr>
+        <w:pStyle w:val="font-claude-response-body"/>
+      </w:pPr>
+      <w:r>
+        <w:rPr>
+          <w:rStyle w:val="animating6ta1u10"/>
+          <w:rFonts w:eastAsiaTheme="majorEastAsia"/>
+          <w:b/>
+          <w:bCs/>
+        </w:rPr>
+        <w:t>Indications: 0.333 → 0.833 (+50 points).</w:t>
+      </w:r>
+      <w:r>
+        <w:rPr>
+          <w:rStyle w:val="animating6ta1u10"/>
+          <w:rFonts w:eastAsiaTheme="majorEastAsia"/>
+        </w:rPr>
+        <w:t xml:space="preserve"> My prediction held, and the probe explained why: IU-001's gold chunk was sitting at position 7, out-ranked by other same-drug chunks, and the cross-encoder read the (query, chunk) pairs and promoted the true indications chunk. The category that </w:t>
+      </w:r>
+      <w:r>
+        <w:rPr>
+          <w:rStyle w:val="animating6ta1u10"/>
+          <w:rFonts w:eastAsiaTheme="majorEastAsia"/>
+          <w:i/>
+          <w:iCs/>
+        </w:rPr>
+        <w:t>neither A nor B could touch</w:t>
+      </w:r>
+      <w:r>
+        <w:rPr>
+          <w:rStyle w:val="animating6ta1u10"/>
+          <w:rFonts w:eastAsiaTheme="majorEastAsia"/>
+        </w:rPr>
+        <w:t xml:space="preserve"> is now your second-most-improved. This is the clean mechanistic story for the paper: embedding similarity mis-orders same-drug chunks; joint query-chunk scoring fixes the ordering.</w:t>
+      </w:r>
+    </w:p>
+    <w:p>
+      <w:pPr>
+        <w:pStyle w:val="font-claude-response-body"/>
+      </w:pPr>
+      <w:r>
+        <w:rPr>
+          <w:rStyle w:val="animating6ta1u10"/>
+          <w:rFonts w:eastAsiaTheme="majorEastAsia"/>
+          <w:b/>
+          <w:bCs/>
+        </w:rPr>
+        <w:t>Contraindications: 0.429 → 0.714 (+28.5 points).</w:t>
+      </w:r>
+      <w:r>
+        <w:rPr>
+          <w:rStyle w:val="animating6ta1u10"/>
+          <w:rFonts w:eastAsiaTheme="majorEastAsia"/>
+        </w:rPr>
+        <w:t xml:space="preserve"> My </w:t>
+      </w:r>
+      <w:r>
+        <w:rPr>
+          <w:rStyle w:val="animating6ta1u10"/>
+          <w:rFonts w:eastAsiaTheme="majorEastAsia"/>
+          <w:i/>
+          <w:iCs/>
+        </w:rPr>
+        <w:t>weaker</w:t>
+      </w:r>
+      <w:r>
+        <w:rPr>
+          <w:rStyle w:val="animating6ta1u10"/>
+          <w:rFonts w:eastAsiaTheme="majorEastAsia"/>
+        </w:rPr>
+        <w:t xml:space="preserve"> prediction was wrong — I guessed contraindications would stay flat because of boilerplate. It improved substantially. So reranking is fixing more ordering failures than I expected, even in the boilerplate-heavy category. Good — being wrong here is in your favor, and worth noting honestly in the write-up rather than pretending I called it.</w:t>
+      </w:r>
+    </w:p>
+    <w:p>
+      <w:pPr>
+        <w:pStyle w:val="font-claude-response-body"/>
+      </w:pPr>
+      <w:r>
+        <w:rPr>
+          <w:rStyle w:val="animating6ta1u10"/>
+          <w:rFonts w:eastAsiaTheme="majorEastAsia"/>
+          <w:b/>
+          <w:bCs/>
+        </w:rPr>
+        <w:t xml:space="preserve">Refusal accuracy: 0.7059 → </w:t>
+      </w:r>
+      <w:proofErr w:type="gramStart"/>
+      <w:r>
+        <w:rPr>
+          <w:rStyle w:val="animating6ta1u10"/>
+          <w:rFonts w:eastAsiaTheme="majorEastAsia"/>
+          <w:b/>
+          <w:bCs/>
+        </w:rPr>
+        <w:t>0.7765, and</w:t>
+      </w:r>
+      <w:proofErr w:type="gramEnd"/>
+      <w:r>
+        <w:rPr>
+          <w:rStyle w:val="animating6ta1u10"/>
+          <w:rFonts w:eastAsiaTheme="majorEastAsia"/>
+          <w:b/>
+          <w:bCs/>
+        </w:rPr>
+        <w:t xml:space="preserve"> look at the scope breakdown</w:t>
+      </w:r>
+      <w:r>
+        <w:rPr>
+          <w:rStyle w:val="animating6ta1u10"/>
+          <w:rFonts w:eastAsiaTheme="majorEastAsia"/>
+        </w:rPr>
+        <w:t xml:space="preserve"> — </w:t>
+      </w:r>
+      <w:proofErr w:type="spellStart"/>
+      <w:r>
+        <w:rPr>
+          <w:rStyle w:val="animating6ta1u10"/>
+          <w:rFonts w:eastAsiaTheme="majorEastAsia"/>
+        </w:rPr>
+        <w:t>near_scope</w:t>
+      </w:r>
+      <w:proofErr w:type="spellEnd"/>
+      <w:r>
+        <w:rPr>
+          <w:rStyle w:val="animating6ta1u10"/>
+          <w:rFonts w:eastAsiaTheme="majorEastAsia"/>
+        </w:rPr>
+        <w:t xml:space="preserve"> 12/12 (1.00), </w:t>
+      </w:r>
+      <w:proofErr w:type="spellStart"/>
+      <w:r>
+        <w:rPr>
+          <w:rStyle w:val="animating6ta1u10"/>
+          <w:rFonts w:eastAsiaTheme="majorEastAsia"/>
+        </w:rPr>
+        <w:t>out_of_scope</w:t>
+      </w:r>
+      <w:proofErr w:type="spellEnd"/>
+      <w:r>
+        <w:rPr>
+          <w:rStyle w:val="animating6ta1u10"/>
+          <w:rFonts w:eastAsiaTheme="majorEastAsia"/>
+        </w:rPr>
+        <w:t xml:space="preserve"> 10/10 (1.00). Both perfect. This is a second-order effect worth understanding: better retrieval means the refuse-queries that were accidentally finding weak-but-present evidence now get </w:t>
+      </w:r>
+      <w:r>
+        <w:rPr>
+          <w:rStyle w:val="animating6ta1u10"/>
+          <w:rFonts w:eastAsiaTheme="majorEastAsia"/>
+          <w:i/>
+          <w:iCs/>
+        </w:rPr>
+        <w:t>cleaner</w:t>
+      </w:r>
+      <w:r>
+        <w:rPr>
+          <w:rStyle w:val="animating6ta1u10"/>
+          <w:rFonts w:eastAsiaTheme="majorEastAsia"/>
+        </w:rPr>
+        <w:t xml:space="preserve"> signals, and the refusal guard makes better calls. And adversarial went 0.40 → 0.60 (3/5) — still your weakest bucket, still the safety-intent finding stands, but even it improved.</w:t>
+      </w:r>
+    </w:p>
+    <w:p>
+      <w:pPr>
+        <w:pStyle w:val="p2"/>
+      </w:pPr>
+    </w:p>
+    <w:p>
+      <w:pPr>
+        <w:pStyle w:val="p2"/>
+      </w:pPr>
+      <w:r>
+        <w:lastRenderedPageBreak/>
+        <w:t>Tradeoff –</w:t>
+      </w:r>
+    </w:p>
+    <w:p>
+      <w:pPr>
+        <w:pStyle w:val="font-claude-response-body"/>
+      </w:pPr>
+      <w:r>
+        <w:rPr>
+          <w:rStyle w:val="Strong"/>
+          <w:rFonts w:eastAsiaTheme="majorEastAsia"/>
+        </w:rPr>
+        <w:t>Latency roughly doubled on retrieval: 82ms → 899ms</w:t>
+      </w:r>
+      <w:r>
+        <w:t xml:space="preserve"> (and validation rose too). The cross-encoder scores 20 pairs per query on CPU. Your end-to-end is still dominated by generation (~9.6s), so the user-facing impact is modest, but the retrieval stage is 11× slower. This is the accuracy/latency trade-off — report it plainly. It's a feature of the analysis, not a flaw.</w:t>
+      </w:r>
+    </w:p>
+    <w:p>
+      <w:pPr>
+        <w:pStyle w:val="font-claude-response-body"/>
+      </w:pPr>
+      <w:r>
+        <w:rPr>
+          <w:rStyle w:val="Strong"/>
+          <w:rFonts w:eastAsiaTheme="majorEastAsia"/>
+        </w:rPr>
+        <w:t>Some categories dropped on gold-chunk even as alias rose</w:t>
+      </w:r>
+      <w:r>
+        <w:t xml:space="preserve"> — </w:t>
+      </w:r>
+      <w:proofErr w:type="spellStart"/>
+      <w:r>
+        <w:t>adverse_reactions</w:t>
+      </w:r>
+      <w:proofErr w:type="spellEnd"/>
+      <w:r>
+        <w:t xml:space="preserve"> gold 0.500 → 0.375, </w:t>
+      </w:r>
+      <w:proofErr w:type="spellStart"/>
+      <w:r>
+        <w:t>multi_drug</w:t>
+      </w:r>
+      <w:proofErr w:type="spellEnd"/>
+      <w:r>
+        <w:t xml:space="preserve"> gold 0.429 → 0.286. Reranking isn't uniformly positive at the exact-chunk level; for a few queries it promoted a right-section-wrong-specific-chunk above the gold one. Net gold-chunk is strongly up (+15.5), but it's not monotonic per-category. Report the net and note the exceptions — same intellectual honesty that made Option B's write-up credible.</w:t>
+      </w:r>
+    </w:p>
+    <w:p>
+      <w:pPr>
+        <w:pStyle w:val="font-claude-response-body"/>
+      </w:pPr>
+      <w:proofErr w:type="spellStart"/>
+      <w:r>
+        <w:rPr>
+          <w:rStyle w:val="Strong"/>
+          <w:rFonts w:eastAsiaTheme="majorEastAsia"/>
+        </w:rPr>
+        <w:t>Groundedness</w:t>
+      </w:r>
+      <w:proofErr w:type="spellEnd"/>
+      <w:r>
+        <w:rPr>
+          <w:rStyle w:val="Strong"/>
+          <w:rFonts w:eastAsiaTheme="majorEastAsia"/>
+        </w:rPr>
+        <w:t xml:space="preserve"> 0.41 → 0.46</w:t>
+      </w:r>
+      <w:r>
+        <w:t xml:space="preserve"> — improved, but still low, and still partly the measurement artifact (refuse-queries contributing 0%). Don't over-read it; the real fix is the average-only-over-answered-queries change you deferred.</w:t>
+      </w:r>
+    </w:p>
+    <w:p>
+      <w:pPr>
+        <w:pStyle w:val="p2"/>
+      </w:pPr>
+      <w:r>
+        <w:t>Fix to meet the target scores</w:t>
+      </w:r>
+    </w:p>
+    <w:p>
+      <w:pPr>
+        <w:pStyle w:val="p2"/>
+        <w:jc w:val="both"/>
+      </w:pPr>
+      <w:r>
+        <w:t xml:space="preserve">The core issue in RAG-for-pharma isn't building a retriever — it's proving the answers are reliable enough for a regulated setting. That requires a benchmark, and the benchmark's ground truth </w:t>
+      </w:r>
+      <w:proofErr w:type="gramStart"/>
+      <w:r>
+        <w:t>has to</w:t>
+      </w:r>
+      <w:proofErr w:type="gramEnd"/>
+      <w:r>
+        <w:t xml:space="preserve"> be trustworthy. </w:t>
+      </w:r>
+      <w:proofErr w:type="gramStart"/>
+      <w:r>
+        <w:t>So</w:t>
+      </w:r>
+      <w:proofErr w:type="gramEnd"/>
+      <w:r>
+        <w:t xml:space="preserve"> the first substantial work was building test_queries_v</w:t>
+      </w:r>
+      <w:proofErr w:type="gramStart"/>
+      <w:r>
+        <w:t>2.json</w:t>
+      </w:r>
+      <w:proofErr w:type="gramEnd"/>
+      <w:r>
+        <w:t>: 85 queries spanning 12 categories (contraindications, adverse reactions, warnings, dosing, indications, interactions, populations, plus patient-phrased, multi-drug, and three kinds of "should refuse" queries — near-scope real non-MS drugs, out-of-scope, and adversarial safety-violation queries). Each answer-query carries a human-annotated gold reference: the exact chunk ID and verbatim snippet from the corpus that answers it. I annotated these by hand rather than letting an LLM generate them, because if the model being evaluated also produced the ground truth, the benchmark would be circular and uncitable. That manual-annotation discipline is what makes the set a research artifact.</w:t>
+      </w:r>
+    </w:p>
+    <w:p>
+      <w:pPr>
+        <w:pStyle w:val="p2"/>
+        <w:jc w:val="both"/>
+      </w:pPr>
+      <w:r>
+        <w:t xml:space="preserve">During annotation I discovered three drugs — </w:t>
+      </w:r>
+      <w:proofErr w:type="spellStart"/>
+      <w:r>
+        <w:t>Kesimpta</w:t>
+      </w:r>
+      <w:proofErr w:type="spellEnd"/>
+      <w:r>
+        <w:t xml:space="preserve">, </w:t>
+      </w:r>
+      <w:proofErr w:type="spellStart"/>
+      <w:r>
+        <w:t>Mavenclad</w:t>
+      </w:r>
+      <w:proofErr w:type="spellEnd"/>
+      <w:r>
+        <w:t xml:space="preserve">, Lemtrada — had been silently ingested as their </w:t>
+      </w:r>
+      <w:r>
+        <w:rPr>
+          <w:rStyle w:val="Emphasis"/>
+          <w:rFonts w:eastAsiaTheme="majorEastAsia"/>
+        </w:rPr>
+        <w:t>oncology</w:t>
+      </w:r>
+      <w:r>
+        <w:t xml:space="preserve"> formulations (ARZERRA, Cladribine Injection, CAMPATH) instead of their MS labels. Root cause: the </w:t>
+      </w:r>
+      <w:proofErr w:type="spellStart"/>
+      <w:r>
+        <w:t>DailyMed</w:t>
+      </w:r>
+      <w:proofErr w:type="spellEnd"/>
+      <w:r>
+        <w:t xml:space="preserve"> API was searched by generic name, and for these three the first result returned is the older oncology product. The pipeline grabbed the first hit. I fixed it by pinning formulation-specific </w:t>
+      </w:r>
+      <w:proofErr w:type="spellStart"/>
+      <w:r>
+        <w:t>SetIDs</w:t>
+      </w:r>
+      <w:proofErr w:type="spellEnd"/>
+      <w:r>
+        <w:t xml:space="preserve">, re-ingesting, and rebuilding the index (corpus went 698 → 723 chunks). </w:t>
+      </w:r>
+      <w:r>
+        <w:rPr>
+          <w:rStyle w:val="Strong"/>
+          <w:rFonts w:eastAsiaTheme="majorEastAsia"/>
+        </w:rPr>
+        <w:t>This is a finding, not just a fix</w:t>
+      </w:r>
+      <w:r>
+        <w:t xml:space="preserve"> — it's direct evidence for why regulated RAG pipelines need human-in-the-loop data validation, and it's a story worth telling in the paper. The error survived automated ingestion and was caught only by manual review.</w:t>
+      </w:r>
+    </w:p>
+    <w:p>
+      <w:pPr>
+        <w:pStyle w:val="p2"/>
+        <w:jc w:val="both"/>
+      </w:pPr>
+      <w:r>
+        <w:t>Before measuring anything, I corrected the evaluation itself: alias-aware matching (so natalizumab/Tysabri/</w:t>
+      </w:r>
+      <w:proofErr w:type="spellStart"/>
+      <w:r>
+        <w:t>Tyruko</w:t>
+      </w:r>
+      <w:proofErr w:type="spellEnd"/>
+      <w:r>
+        <w:t xml:space="preserve"> count as the same drug), a stricter </w:t>
+      </w:r>
+      <w:r>
+        <w:rPr>
+          <w:rStyle w:val="Emphasis"/>
+          <w:rFonts w:eastAsiaTheme="majorEastAsia"/>
+        </w:rPr>
+        <w:t>gold-chunk</w:t>
+      </w:r>
+      <w:r>
+        <w:t xml:space="preserve"> recall metric (did we retrieve </w:t>
+      </w:r>
+      <w:r>
+        <w:rPr>
+          <w:rStyle w:val="Emphasis"/>
+          <w:rFonts w:eastAsiaTheme="majorEastAsia"/>
+        </w:rPr>
+        <w:t>the exact</w:t>
+      </w:r>
+      <w:r>
+        <w:t xml:space="preserve"> annotated chunk, not just something from the right area), and behavior-aware refusal scoring across scope buckets. This matters because measuring against a broken ruler makes every later comparison meaningless.</w:t>
+      </w:r>
+    </w:p>
+    <w:p>
+      <w:pPr>
+        <w:pStyle w:val="p2"/>
+        <w:jc w:val="both"/>
+      </w:pPr>
+      <w:r>
+        <w:lastRenderedPageBreak/>
+        <w:t xml:space="preserve">With correct data and correct metrics: Recall@5 = 0.707 (meets the ≥0.70 target), gold-chunk Recall@5 = 0.448, </w:t>
+      </w:r>
+      <w:proofErr w:type="spellStart"/>
+      <w:r>
+        <w:t>nDCG</w:t>
+      </w:r>
+      <w:proofErr w:type="spellEnd"/>
+      <w:r>
+        <w:t xml:space="preserve"> = 0.963, refusal accuracy = 0.706. Two categories were clearly weakest — contraindications (0.429) and indications (0.333) — and I traced </w:t>
+      </w:r>
+      <w:r>
+        <w:rPr>
+          <w:rStyle w:val="Emphasis"/>
+          <w:rFonts w:eastAsiaTheme="majorEastAsia"/>
+        </w:rPr>
+        <w:t>why</w:t>
+      </w:r>
+      <w:r>
+        <w:t>: MS drug labels have near-identical indications sections ("relapsing forms of multiple sclerosis..."), so embedding similarity can't tell which drug's chunk to pull. The router (which maps a query to its likely label section) contributed +8.6 points on its own — a clean ablation result.</w:t>
+      </w:r>
+    </w:p>
+    <w:p>
+      <w:pPr>
+        <w:pStyle w:val="p2"/>
+        <w:jc w:val="both"/>
+      </w:pPr>
+      <w:r>
+        <w:t xml:space="preserve">The discipline: freeze the test set, lock the baseline, then test each retrieval enhancement in </w:t>
+      </w:r>
+      <w:r>
+        <w:rPr>
+          <w:rStyle w:val="Emphasis"/>
+          <w:rFonts w:eastAsiaTheme="majorEastAsia"/>
+        </w:rPr>
+        <w:t>isolation</w:t>
+      </w:r>
+      <w:r>
+        <w:t xml:space="preserve"> — one variable at a time — so each improvement is attributable. Three options:</w:t>
+      </w:r>
+    </w:p>
+    <w:p>
+      <w:pPr>
+        <w:spacing w:after="0" w:line="240" w:lineRule="auto"/>
+        <w:rPr>
+          <w:rFonts w:ascii="Times New Roman" w:eastAsia="Times New Roman" w:hAnsi="Times New Roman" w:cs="Times New Roman"/>
+          <w:kern w:val="0"/>
+          <w14:ligatures w14:val="none"/>
+        </w:rPr>
+      </w:pPr>
+      <w:proofErr w:type="gramStart"/>
+      <w:r>
+        <w:rPr>
+          <w:rFonts w:ascii="Times New Roman" w:eastAsia="Times New Roman" w:hAnsi="Symbol" w:cs="Times New Roman"/>
+          <w:kern w:val="0"/>
+          <w14:ligatures w14:val="none"/>
+        </w:rPr>
+        <w:t></w:t>
+      </w:r>
+      <w:r>
+        <w:rPr>
+          <w:rFonts w:ascii="Times New Roman" w:eastAsia="Times New Roman" w:hAnsi="Times New Roman" w:cs="Times New Roman"/>
+          <w:kern w:val="0"/>
+          <w14:ligatures w14:val="none"/>
+        </w:rPr>
+        <w:t xml:space="preserve">  </w:t>
+      </w:r>
+      <w:r>
+        <w:rPr>
+          <w:rFonts w:ascii="Times New Roman" w:eastAsia="Times New Roman" w:hAnsi="Times New Roman" w:cs="Times New Roman"/>
+          <w:b/>
+          <w:bCs/>
+          <w:kern w:val="0"/>
+          <w14:ligatures w14:val="none"/>
+        </w:rPr>
+        <w:t>Option</w:t>
+      </w:r>
+      <w:proofErr w:type="gramEnd"/>
+      <w:r>
+        <w:rPr>
+          <w:rFonts w:ascii="Times New Roman" w:eastAsia="Times New Roman" w:hAnsi="Times New Roman" w:cs="Times New Roman"/>
+          <w:b/>
+          <w:bCs/>
+          <w:kern w:val="0"/>
+          <w14:ligatures w14:val="none"/>
+        </w:rPr>
+        <w:t xml:space="preserve"> A — query expansion.</w:t>
+      </w:r>
+      <w:r>
+        <w:rPr>
+          <w:rFonts w:ascii="Times New Roman" w:eastAsia="Times New Roman" w:hAnsi="Times New Roman" w:cs="Times New Roman"/>
+          <w:kern w:val="0"/>
+          <w14:ligatures w14:val="none"/>
+        </w:rPr>
+        <w:t xml:space="preserve"> Append clinical synonyms to lay-phrased queries (liver → hepatic, side effects → adverse reactions). Result: +1.7 Recall@5, and the entire gain was in the </w:t>
+      </w:r>
+      <w:proofErr w:type="spellStart"/>
+      <w:r>
+        <w:rPr>
+          <w:rFonts w:ascii="Times New Roman" w:eastAsia="Times New Roman" w:hAnsi="Times New Roman" w:cs="Times New Roman"/>
+          <w:kern w:val="0"/>
+          <w14:ligatures w14:val="none"/>
+        </w:rPr>
+        <w:t>patient_style</w:t>
+      </w:r>
+      <w:proofErr w:type="spellEnd"/>
+      <w:r>
+        <w:rPr>
+          <w:rFonts w:ascii="Times New Roman" w:eastAsia="Times New Roman" w:hAnsi="Times New Roman" w:cs="Times New Roman"/>
+          <w:kern w:val="0"/>
+          <w14:ligatures w14:val="none"/>
+        </w:rPr>
+        <w:t xml:space="preserve"> category (+16.7); every other category was flat. Clean demonstration that vocabulary bridging helps lay phrasing and nothing else. </w:t>
+      </w:r>
+    </w:p>
+    <w:p>
+      <w:pPr>
+        <w:spacing w:after="0" w:line="240" w:lineRule="auto"/>
+        <w:rPr>
+          <w:rFonts w:ascii="Times New Roman" w:eastAsia="Times New Roman" w:hAnsi="Times New Roman" w:cs="Times New Roman"/>
+          <w:kern w:val="0"/>
+          <w14:ligatures w14:val="none"/>
+        </w:rPr>
+      </w:pPr>
+      <w:proofErr w:type="gramStart"/>
+      <w:r>
+        <w:rPr>
+          <w:rFonts w:ascii="Times New Roman" w:eastAsia="Times New Roman" w:hAnsi="Symbol" w:cs="Times New Roman"/>
+          <w:kern w:val="0"/>
+          <w14:ligatures w14:val="none"/>
+        </w:rPr>
+        <w:t></w:t>
+      </w:r>
+      <w:r>
+        <w:rPr>
+          <w:rFonts w:ascii="Times New Roman" w:eastAsia="Times New Roman" w:hAnsi="Times New Roman" w:cs="Times New Roman"/>
+          <w:kern w:val="0"/>
+          <w14:ligatures w14:val="none"/>
+        </w:rPr>
+        <w:t xml:space="preserve">  </w:t>
+      </w:r>
+      <w:r>
+        <w:rPr>
+          <w:rFonts w:ascii="Times New Roman" w:eastAsia="Times New Roman" w:hAnsi="Times New Roman" w:cs="Times New Roman"/>
+          <w:b/>
+          <w:bCs/>
+          <w:kern w:val="0"/>
+          <w14:ligatures w14:val="none"/>
+        </w:rPr>
+        <w:t>Option</w:t>
+      </w:r>
+      <w:proofErr w:type="gramEnd"/>
+      <w:r>
+        <w:rPr>
+          <w:rFonts w:ascii="Times New Roman" w:eastAsia="Times New Roman" w:hAnsi="Times New Roman" w:cs="Times New Roman"/>
+          <w:b/>
+          <w:bCs/>
+          <w:kern w:val="0"/>
+          <w14:ligatures w14:val="none"/>
+        </w:rPr>
+        <w:t xml:space="preserve"> B — context-enriched embeddings.</w:t>
+      </w:r>
+      <w:r>
+        <w:rPr>
+          <w:rFonts w:ascii="Times New Roman" w:eastAsia="Times New Roman" w:hAnsi="Times New Roman" w:cs="Times New Roman"/>
+          <w:kern w:val="0"/>
+          <w14:ligatures w14:val="none"/>
+        </w:rPr>
+        <w:t xml:space="preserve"> Prepend "Drug: X | Section: Y" to each chunk before embedding. Result: +3.4 Recall@5 — but gold-chunk Recall went </w:t>
+      </w:r>
+      <w:r>
+        <w:rPr>
+          <w:rFonts w:ascii="Times New Roman" w:eastAsia="Times New Roman" w:hAnsi="Times New Roman" w:cs="Times New Roman"/>
+          <w:i/>
+          <w:iCs/>
+          <w:kern w:val="0"/>
+          <w14:ligatures w14:val="none"/>
+        </w:rPr>
+        <w:t>down</w:t>
+      </w:r>
+      <w:r>
+        <w:rPr>
+          <w:rFonts w:ascii="Times New Roman" w:eastAsia="Times New Roman" w:hAnsi="Times New Roman" w:cs="Times New Roman"/>
+          <w:kern w:val="0"/>
+          <w14:ligatures w14:val="none"/>
+        </w:rPr>
+        <w:t xml:space="preserve"> 3.4. It helped content-rich sections (adverse reactions, dosing) find </w:t>
+      </w:r>
+      <w:r>
+        <w:rPr>
+          <w:rFonts w:ascii="Times New Roman" w:eastAsia="Times New Roman" w:hAnsi="Times New Roman" w:cs="Times New Roman"/>
+          <w:i/>
+          <w:iCs/>
+          <w:kern w:val="0"/>
+          <w14:ligatures w14:val="none"/>
+        </w:rPr>
+        <w:t>a</w:t>
+      </w:r>
+      <w:r>
+        <w:rPr>
+          <w:rFonts w:ascii="Times New Roman" w:eastAsia="Times New Roman" w:hAnsi="Times New Roman" w:cs="Times New Roman"/>
+          <w:kern w:val="0"/>
+          <w14:ligatures w14:val="none"/>
+        </w:rPr>
+        <w:t xml:space="preserve"> right-section chunk more often, but made same-section chunks look alike, so it retrieved fewer of the </w:t>
+      </w:r>
+      <w:r>
+        <w:rPr>
+          <w:rFonts w:ascii="Times New Roman" w:eastAsia="Times New Roman" w:hAnsi="Times New Roman" w:cs="Times New Roman"/>
+          <w:i/>
+          <w:iCs/>
+          <w:kern w:val="0"/>
+          <w14:ligatures w14:val="none"/>
+        </w:rPr>
+        <w:t>exact</w:t>
+      </w:r>
+      <w:r>
+        <w:rPr>
+          <w:rFonts w:ascii="Times New Roman" w:eastAsia="Times New Roman" w:hAnsi="Times New Roman" w:cs="Times New Roman"/>
+          <w:kern w:val="0"/>
+          <w14:ligatures w14:val="none"/>
+        </w:rPr>
+        <w:t xml:space="preserve"> gold chunks. A genuine precision/recall trade-off — and the fact that our two-metric evaluation </w:t>
+      </w:r>
+      <w:r>
+        <w:rPr>
+          <w:rFonts w:ascii="Times New Roman" w:eastAsia="Times New Roman" w:hAnsi="Times New Roman" w:cs="Times New Roman"/>
+          <w:i/>
+          <w:iCs/>
+          <w:kern w:val="0"/>
+          <w14:ligatures w14:val="none"/>
+        </w:rPr>
+        <w:t>caught</w:t>
+      </w:r>
+      <w:r>
+        <w:rPr>
+          <w:rFonts w:ascii="Times New Roman" w:eastAsia="Times New Roman" w:hAnsi="Times New Roman" w:cs="Times New Roman"/>
+          <w:kern w:val="0"/>
+          <w14:ligatures w14:val="none"/>
+        </w:rPr>
+        <w:t xml:space="preserve"> that trade-off (a single-metric eval would've called it a clean win) is itself a contribution. </w:t>
+      </w:r>
+    </w:p>
+    <w:p>
+      <w:pPr>
+        <w:pStyle w:val="p2"/>
+        <w:jc w:val="both"/>
+      </w:pPr>
+      <w:proofErr w:type="gramStart"/>
+      <w:r>
+        <w:rPr>
+          <w:rFonts w:hAnsi="Symbol"/>
+        </w:rPr>
+        <w:t></w:t>
+      </w:r>
+      <w:r>
+        <w:t xml:space="preserve">  </w:t>
+      </w:r>
+      <w:r>
+        <w:rPr>
+          <w:b/>
+          <w:bCs/>
+        </w:rPr>
+        <w:t>Option</w:t>
+      </w:r>
+      <w:proofErr w:type="gramEnd"/>
+      <w:r>
+        <w:rPr>
+          <w:b/>
+          <w:bCs/>
+        </w:rPr>
+        <w:t xml:space="preserve"> C — cross-encoder reranking.</w:t>
+      </w:r>
+      <w:r>
+        <w:t xml:space="preserve"> Retrieve a wide pool (</w:t>
+      </w:r>
+      <w:proofErr w:type="gramStart"/>
+      <w:r>
+        <w:t>top-20</w:t>
+      </w:r>
+      <w:proofErr w:type="gramEnd"/>
+      <w:r>
+        <w:t xml:space="preserve">), then re-score each (query, chunk) pair jointly with a cross-encoder and take the best 5. Result: </w:t>
+      </w:r>
+      <w:r>
+        <w:rPr>
+          <w:b/>
+          <w:bCs/>
+        </w:rPr>
+        <w:t>the big one.</w:t>
+      </w:r>
+      <w:r>
+        <w:t xml:space="preserve"> Recall@5 0.707 → 0.845 (+13.8), gold-chunk 0.448 → 0.603 (+15.5), indications 0.333 → 0.833 (+50), contraindications 0.429 → 0.714 (+28.5), refusal accuracy up to 0.777 with near-scope and out-of-scope both perfect. Cost: retrieval latency ~11× (82ms → 899ms), still dwarfed by generation. The mechanism: embedding similarity mis-orders same-drug chunks; reading the query and chunk </w:t>
+      </w:r>
+      <w:r>
+        <w:rPr>
+          <w:i/>
+          <w:iCs/>
+        </w:rPr>
+        <w:t>together</w:t>
+      </w:r>
+      <w:r>
+        <w:t xml:space="preserve"> fixes the ordering.</w:t>
+      </w:r>
+    </w:p>
+    <w:p>
+      <w:pPr>
+        <w:pStyle w:val="p2"/>
+        <w:jc w:val="both"/>
+      </w:pPr>
+      <w:r>
+        <w:t xml:space="preserve">each option targets a </w:t>
+      </w:r>
+      <w:r>
+        <w:rPr>
+          <w:rStyle w:val="Emphasis"/>
+          <w:rFonts w:eastAsiaTheme="majorEastAsia"/>
+        </w:rPr>
+        <w:t>distinct</w:t>
+      </w:r>
+      <w:r>
+        <w:t xml:space="preserve"> failure mode — A fixes vocabulary mismatch, B fixes section-content recall at a precision cost, C fixes chunk ordering. And the architecture has two complementary safety layers: </w:t>
+      </w:r>
+      <w:r>
+        <w:rPr>
+          <w:rStyle w:val="Strong"/>
+          <w:rFonts w:eastAsiaTheme="majorEastAsia"/>
+        </w:rPr>
+        <w:t>reranking catches "did we retrieve the right evidence?", the Evidence Validator catches "did the model use it correctly?"</w:t>
+      </w:r>
+      <w:r>
+        <w:t xml:space="preserve"> Those are different failure </w:t>
+      </w:r>
+      <w:proofErr w:type="gramStart"/>
+      <w:r>
+        <w:t>modes</w:t>
+      </w:r>
+      <w:proofErr w:type="gramEnd"/>
+      <w:r>
+        <w:t xml:space="preserve"> and both need covering.</w:t>
+      </w:r>
+    </w:p>
+    <w:p>
+      <w:pPr>
+        <w:pStyle w:val="font-claude-response-body"/>
+      </w:pPr>
+      <w:r>
+        <w:t xml:space="preserve">Your novelty, stated precisely, is this: </w:t>
+      </w:r>
+      <w:r>
+        <w:rPr>
+          <w:rStyle w:val="Strong"/>
+          <w:rFonts w:eastAsiaTheme="majorEastAsia"/>
+        </w:rPr>
+        <w:t xml:space="preserve">an evaluation framework and agentic architecture for RAG reliability that measures abstention and </w:t>
+      </w:r>
+      <w:proofErr w:type="spellStart"/>
+      <w:r>
+        <w:rPr>
+          <w:rStyle w:val="Strong"/>
+          <w:rFonts w:eastAsiaTheme="majorEastAsia"/>
+        </w:rPr>
+        <w:t>groundedness</w:t>
+      </w:r>
+      <w:proofErr w:type="spellEnd"/>
+      <w:r>
+        <w:rPr>
+          <w:rStyle w:val="Strong"/>
+          <w:rFonts w:eastAsiaTheme="majorEastAsia"/>
+        </w:rPr>
+        <w:t xml:space="preserve"> — not just answer correctness — in a safety-critical pharma setting.</w:t>
+      </w:r>
+      <w:r>
+        <w:t xml:space="preserve"> Your three contributions:</w:t>
+      </w:r>
+    </w:p>
+    <w:p>
+      <w:pPr>
+        <w:pStyle w:val="font-claude-response-body"/>
+        <w:numPr>
+          <w:ilvl w:val="0"/>
+          <w:numId w:val="24"/>
+        </w:numPr>
+      </w:pPr>
+      <w:r>
+        <w:rPr>
+          <w:rStyle w:val="Strong"/>
+          <w:rFonts w:eastAsiaTheme="majorEastAsia"/>
+        </w:rPr>
+        <w:t>A refusal-aware evaluation methodology.</w:t>
+      </w:r>
+      <w:r>
+        <w:t xml:space="preserve"> Existing benchmarks have no notion of "correctly declining to answer." Your test set deliberately includes out-of-scope and adversarial queries, and your refusal-accuracy metric scores whether the system abstains appropriately. This is genuinely under-explored.</w:t>
+      </w:r>
+    </w:p>
+    <w:p>
+      <w:pPr>
+        <w:pStyle w:val="font-claude-response-body"/>
+        <w:numPr>
+          <w:ilvl w:val="0"/>
+          <w:numId w:val="24"/>
+        </w:numPr>
+      </w:pPr>
+      <w:r>
+        <w:rPr>
+          <w:rStyle w:val="Strong"/>
+          <w:rFonts w:eastAsiaTheme="majorEastAsia"/>
+        </w:rPr>
+        <w:t>The agentic validation layer as a measurable intervention.</w:t>
+      </w:r>
+      <w:r>
+        <w:t xml:space="preserve"> Your ablation (router on/off, validator on/off) quantifies how much each governance component contributes. </w:t>
+      </w:r>
+      <w:r>
+        <w:lastRenderedPageBreak/>
+        <w:t>The literature treats RAG as retrieve-then-generate; you're treating governance as a first-class, measurable architectural layer.</w:t>
+      </w:r>
+    </w:p>
+    <w:p>
+      <w:pPr>
+        <w:pStyle w:val="font-claude-response-body"/>
+        <w:numPr>
+          <w:ilvl w:val="0"/>
+          <w:numId w:val="24"/>
+        </w:numPr>
+      </w:pPr>
+      <w:r>
+        <w:rPr>
+          <w:rStyle w:val="Strong"/>
+          <w:rFonts w:eastAsiaTheme="majorEastAsia"/>
+        </w:rPr>
+        <w:t xml:space="preserve">A characterization of embedding-based </w:t>
+      </w:r>
+      <w:proofErr w:type="spellStart"/>
+      <w:r>
+        <w:rPr>
+          <w:rStyle w:val="Strong"/>
+          <w:rFonts w:eastAsiaTheme="majorEastAsia"/>
+        </w:rPr>
+        <w:t>groundedness</w:t>
+      </w:r>
+      <w:proofErr w:type="spellEnd"/>
+      <w:r>
+        <w:rPr>
+          <w:rStyle w:val="Strong"/>
+          <w:rFonts w:eastAsiaTheme="majorEastAsia"/>
+        </w:rPr>
+        <w:t xml:space="preserve"> validation limits.</w:t>
+      </w:r>
+      <w:r>
+        <w:t xml:space="preserve"> </w:t>
+      </w:r>
+      <w:proofErr w:type="gramStart"/>
+      <w:r>
+        <w:t>Your</w:t>
+      </w:r>
+      <w:proofErr w:type="gramEnd"/>
+      <w:r>
+        <w:t xml:space="preserve"> finding that embedding-similarity validation has a measurable ceiling (and where NLI would be needed) is a </w:t>
+      </w:r>
+      <w:proofErr w:type="gramStart"/>
+      <w:r>
+        <w:t>methods contribution in itself</w:t>
+      </w:r>
+      <w:proofErr w:type="gramEnd"/>
+      <w:r>
+        <w:t>.</w:t>
+      </w:r>
+    </w:p>
+    <w:p>
+      <w:pPr>
+        <w:pStyle w:val="p2"/>
+        <w:jc w:val="both"/>
+      </w:pPr>
+      <w:r>
+        <w:t xml:space="preserve">"While existing medical RAG benchmarks evaluate answer correctness on multiple-choice tasks, none assess the operational reliability dimensions — appropriate abstention, </w:t>
+      </w:r>
+      <w:proofErr w:type="spellStart"/>
+      <w:r>
+        <w:t>groundedness</w:t>
+      </w:r>
+      <w:proofErr w:type="spellEnd"/>
+      <w:r>
+        <w:t xml:space="preserve"> of generated text, and drift — that determine whether a system is safe to deploy in regulated settings. We propose an evaluation framework and agentic architecture that make these dimensions measurable."</w:t>
+      </w:r>
+    </w:p>
+    <w:p>
+      <w:pPr>
+        <w:pStyle w:val="p2"/>
+        <w:jc w:val="both"/>
+      </w:pPr>
+      <w:r>
+        <w:rPr>
+          <w:rStyle w:val="Strong"/>
+          <w:rFonts w:eastAsiaTheme="majorEastAsia"/>
+        </w:rPr>
+        <w:t>T</w:t>
+      </w:r>
+      <w:r>
+        <w:rPr>
+          <w:rStyle w:val="Strong"/>
+          <w:rFonts w:eastAsiaTheme="majorEastAsia"/>
+        </w:rPr>
+        <w:t>he adversarial refusal finding (3/5) is arguably more interesting than your headline numbers.</w:t>
+      </w:r>
+      <w:r>
+        <w:t xml:space="preserve"> "</w:t>
+      </w:r>
+      <w:proofErr w:type="spellStart"/>
+      <w:r>
+        <w:t>Groundedness</w:t>
+      </w:r>
+      <w:proofErr w:type="spellEnd"/>
+      <w:r>
+        <w:t>-based abstention fails on adversarial safety queries because the unsafe question retrieves real, well-grounded evidence — the danger is a well-grounded answer to a question that shouldn't be answered" is a genuinely novel observation about a failure mode that current RAG safety work doesn't address. Don't bury it in limitations. Consider making it a headline finding and the motivation for the safety-intent layer as your proposed future architecture. That's the kind of thing that gets a paper cited.</w:t>
+      </w:r>
+    </w:p>
+    <w:p>
+      <w:pPr>
+        <w:pStyle w:val="font-claude-response-body"/>
+      </w:pPr>
+      <w:r>
+        <w:t xml:space="preserve">You have, right now, an unusually clean finding: </w:t>
+      </w:r>
+      <w:r>
+        <w:rPr>
+          <w:rStyle w:val="Emphasis"/>
+          <w:rFonts w:eastAsiaTheme="majorEastAsia"/>
+        </w:rPr>
+        <w:t>a safety-critical RAG system that correctly abstained on every query where retrieval failed to cover all queried entities.</w:t>
+      </w:r>
+      <w:r>
+        <w:t xml:space="preserve"> That's the refusal guard working as designed, catching a retrieval failure the retrieval metrics themselves scored as perfect. Your architecture caught its own blind spot. That's a </w:t>
+      </w:r>
+      <w:r>
+        <w:rPr>
+          <w:rStyle w:val="Emphasis"/>
+          <w:rFonts w:eastAsiaTheme="majorEastAsia"/>
+        </w:rPr>
+        <w:t>better</w:t>
+      </w:r>
+      <w:r>
+        <w:t xml:space="preserve"> story than "we built multi-hop retrieval," and it directly supports your thesis that abstention is essential infrastructure, not a nice-to-have.</w:t>
+      </w:r>
+    </w:p>
+    <w:p>
+      <w:pPr>
+        <w:pStyle w:val="font-claude-response-body"/>
+      </w:pPr>
+      <w:r>
+        <w:t>Write it as:</w:t>
+      </w:r>
+    </w:p>
+    <w:p>
+      <w:pPr>
+        <w:pStyle w:val="font-claude-response-body"/>
+      </w:pPr>
+      <w:r>
+        <w:t xml:space="preserve">Comparative multi-drug queries revealed a systematic limitation of single-pass top-k retrieval: for 6 of 7 comparison queries, the retrieved evidence covered only one of the two drugs named, because a single ranked list is dominated by whichever entity scores higher. Notably, alias-aware Recall@5 scored these queries 1.000 — the metric checks whether </w:t>
+      </w:r>
+      <w:r>
+        <w:rPr>
+          <w:rStyle w:val="Emphasis"/>
+          <w:rFonts w:eastAsiaTheme="majorEastAsia"/>
+        </w:rPr>
+        <w:t>any</w:t>
+      </w:r>
+      <w:r>
+        <w:t xml:space="preserve"> expected-drug chunk appears, not whether </w:t>
+      </w:r>
+      <w:r>
+        <w:rPr>
+          <w:rStyle w:val="Emphasis"/>
+          <w:rFonts w:eastAsiaTheme="majorEastAsia"/>
+        </w:rPr>
+        <w:t>all</w:t>
+      </w:r>
+      <w:r>
+        <w:t xml:space="preserve"> queried entities are covered. The generator correctly abstained in all seven cases rather than reasoning from absent evidence, and the refusal guard flagged them as INSUFFICIENT_EVIDENCE. This demonstrates the value of the abstention layer as a safety net for retrieval failures that retrieval metrics do not </w:t>
+      </w:r>
+      <w:proofErr w:type="gramStart"/>
+      <w:r>
+        <w:t>detect, and</w:t>
+      </w:r>
+      <w:proofErr w:type="gramEnd"/>
+      <w:r>
+        <w:t xml:space="preserve"> motivates query decomposition with per-entity retrieval for multi-entity questions as future work.</w:t>
+      </w:r>
+    </w:p>
+    <w:p>
+      <w:pPr>
+        <w:pStyle w:val="p2"/>
+        <w:jc w:val="both"/>
+      </w:pPr>
+      <w:r>
+        <w:t xml:space="preserve">MIRAGE </w:t>
+      </w:r>
+      <w:proofErr w:type="spellStart"/>
+      <w:r>
+        <w:t>Reranker</w:t>
+      </w:r>
+      <w:proofErr w:type="spellEnd"/>
+    </w:p>
+    <w:p>
+      <w:pPr>
+        <w:pStyle w:val="p2"/>
+        <w:jc w:val="both"/>
+      </w:pPr>
+      <w:r>
+        <w:t xml:space="preserve">Then the framing paragraph writes itself: </w:t>
+      </w:r>
+      <w:r>
+        <w:rPr>
+          <w:rStyle w:val="Emphasis"/>
+          <w:rFonts w:eastAsiaTheme="majorEastAsia"/>
+        </w:rPr>
+        <w:t xml:space="preserve">"We validate our retrieval stack on MIRAGE to establish external comparability. However, MIRAGE — like existing medical RAG benchmarks — evaluates multiple-choice accuracy only, and does not assess abstention, </w:t>
+      </w:r>
+      <w:proofErr w:type="spellStart"/>
+      <w:r>
+        <w:rPr>
+          <w:rStyle w:val="Emphasis"/>
+          <w:rFonts w:eastAsiaTheme="majorEastAsia"/>
+        </w:rPr>
+        <w:t>groundedness</w:t>
+      </w:r>
+      <w:proofErr w:type="spellEnd"/>
+      <w:r>
+        <w:rPr>
+          <w:rStyle w:val="Emphasis"/>
+          <w:rFonts w:eastAsiaTheme="majorEastAsia"/>
+        </w:rPr>
+        <w:t xml:space="preserve">, or adversarial safety refusal. Our benchmark measures exactly what MIRAGE cannot, which is the gap this work </w:t>
+      </w:r>
+      <w:r>
+        <w:rPr>
+          <w:rStyle w:val="Emphasis"/>
+          <w:rFonts w:eastAsiaTheme="majorEastAsia"/>
+        </w:rPr>
+        <w:lastRenderedPageBreak/>
+        <w:t>addresses."</w:t>
+      </w:r>
+      <w:r>
+        <w:t xml:space="preserve"> That's your novelty claim, and MIRAGE is what makes it credible rather than self-serving.</w:t>
+      </w:r>
+    </w:p>
+    <w:p>
+      <w:pPr>
+        <w:pStyle w:val="p2"/>
+        <w:jc w:val="both"/>
+      </w:pPr>
+      <w:r>
+        <w:t xml:space="preserve">MIRAGE (Xiong et al., ACL Findings 2024) is the standard benchmark for medical RAG, comprising 7,663 questions across five datasets. Its evaluation format is multiple-choice accuracy — </w:t>
+      </w:r>
+      <w:proofErr w:type="spellStart"/>
+      <w:r>
+        <w:t>PubMedQA</w:t>
+      </w:r>
+      <w:proofErr w:type="spellEnd"/>
+      <w:r>
+        <w:t xml:space="preserve"> and </w:t>
+      </w:r>
+      <w:proofErr w:type="spellStart"/>
+      <w:r>
+        <w:t>BioASQ</w:t>
+      </w:r>
+      <w:proofErr w:type="spellEnd"/>
+      <w:r>
+        <w:t xml:space="preserve"> questions, for instance, reduce to yes/no/maybe classification over PubMed abstracts. This format, shared by </w:t>
+      </w:r>
+      <w:proofErr w:type="spellStart"/>
+      <w:r>
+        <w:t>RAGCare</w:t>
+      </w:r>
+      <w:proofErr w:type="spellEnd"/>
+      <w:r>
+        <w:t xml:space="preserve">-QA and other medical RAG benchmarks, measures whether a system selects the correct option. It does not — and structurally cannot — measure whether a system abstains when evidence is absent, whether </w:t>
+      </w:r>
+      <w:proofErr w:type="spellStart"/>
+      <w:r>
+        <w:t>its</w:t>
+      </w:r>
+      <w:proofErr w:type="spellEnd"/>
+      <w:r>
+        <w:t xml:space="preserve"> free-text claims are grounded in the cited passages, or whether it refuses questions that are unsafe to answer regardless of evidence quality. These are precisely the properties that determine whether a RAG system is deployable in a regulated pharmaceutical setting, and they are what our benchmark measures.</w:t>
+      </w:r>
+    </w:p>
+    <w:p>
+      <w:pPr>
+        <w:pStyle w:val="p2"/>
+        <w:jc w:val="both"/>
+      </w:pPr>
+      <w:r>
+        <w:t>To illustrate: on our benchmark, the system correctly abstained on all seven multi-drug comparison queries where retrieval failed to cover both queried entities — failures that alias-aware Recall@5 scored as 1.000. An accuracy-only benchmark would have registered these as successes or, at best, as wrong answers; it could not have distinguished a correct abstention from a failure to know.</w:t>
+      </w:r>
+    </w:p>
+    <w:p>
+      <w:pPr>
+        <w:pStyle w:val="p2"/>
+        <w:jc w:val="both"/>
+      </w:pPr>
+      <w:r>
+        <w:t xml:space="preserve">Defense answer – </w:t>
+      </w:r>
+    </w:p>
+    <w:p>
+      <w:pPr>
+        <w:pStyle w:val="font-claude-response-body"/>
+      </w:pPr>
+      <w:r>
+        <w:t xml:space="preserve">Report </w:t>
+      </w:r>
+      <w:proofErr w:type="spellStart"/>
+      <w:r>
+        <w:t>MedRAG's</w:t>
+      </w:r>
+      <w:proofErr w:type="spellEnd"/>
+      <w:r>
+        <w:t xml:space="preserve"> </w:t>
+      </w:r>
+      <w:r>
+        <w:rPr>
+          <w:rStyle w:val="Strong"/>
+          <w:rFonts w:eastAsiaTheme="majorEastAsia"/>
+        </w:rPr>
+        <w:t>published</w:t>
+      </w:r>
+      <w:r>
+        <w:t xml:space="preserve"> baseline numbers from their paper as a table in related work, alongside a clear statement of what each benchmark measures. Something like: MIRAGE measures MCQ accuracy (published: </w:t>
+      </w:r>
+      <w:proofErr w:type="spellStart"/>
+      <w:r>
+        <w:t>MedCPT</w:t>
+      </w:r>
+      <w:proofErr w:type="spellEnd"/>
+      <w:r>
+        <w:t xml:space="preserve"> ~X% on </w:t>
+      </w:r>
+      <w:proofErr w:type="spellStart"/>
+      <w:r>
+        <w:t>PubMedQA</w:t>
+      </w:r>
+      <w:proofErr w:type="spellEnd"/>
+      <w:r>
+        <w:t xml:space="preserve">); </w:t>
+      </w:r>
+      <w:proofErr w:type="spellStart"/>
+      <w:r>
+        <w:t>PharmaRAG</w:t>
+      </w:r>
+      <w:proofErr w:type="spellEnd"/>
+      <w:r>
+        <w:t xml:space="preserve">-Bench measures Recall@5, gold-chunk recall, </w:t>
+      </w:r>
+      <w:proofErr w:type="spellStart"/>
+      <w:r>
+        <w:t>groundedness</w:t>
+      </w:r>
+      <w:proofErr w:type="spellEnd"/>
+      <w:r>
+        <w:t xml:space="preserve">, hallucination rate, and refusal accuracy across four scope buckets. Different axes. Then say plainly: </w:t>
+      </w:r>
+      <w:r>
+        <w:rPr>
+          <w:rStyle w:val="Emphasis"/>
+          <w:rFonts w:eastAsiaTheme="majorEastAsia"/>
+        </w:rPr>
+        <w:t xml:space="preserve">"No existing medical RAG benchmark evaluates abstention or </w:t>
+      </w:r>
+      <w:proofErr w:type="spellStart"/>
+      <w:r>
+        <w:rPr>
+          <w:rStyle w:val="Emphasis"/>
+          <w:rFonts w:eastAsiaTheme="majorEastAsia"/>
+        </w:rPr>
+        <w:t>groundedness</w:t>
+      </w:r>
+      <w:proofErr w:type="spellEnd"/>
+      <w:r>
+        <w:rPr>
+          <w:rStyle w:val="Emphasis"/>
+          <w:rFonts w:eastAsiaTheme="majorEastAsia"/>
+        </w:rPr>
+        <w:t xml:space="preserve">; direct numerical comparison is therefore not </w:t>
+      </w:r>
+      <w:proofErr w:type="gramStart"/>
+      <w:r>
+        <w:rPr>
+          <w:rStyle w:val="Emphasis"/>
+          <w:rFonts w:eastAsiaTheme="majorEastAsia"/>
+        </w:rPr>
+        <w:t>possible, and</w:t>
+      </w:r>
+      <w:proofErr w:type="gramEnd"/>
+      <w:r>
+        <w:rPr>
+          <w:rStyle w:val="Emphasis"/>
+          <w:rFonts w:eastAsiaTheme="majorEastAsia"/>
+        </w:rPr>
+        <w:t xml:space="preserve"> establishing that comparison is a contribution of this work."</w:t>
+      </w:r>
+    </w:p>
+    <w:p>
+      <w:pPr>
+        <w:pStyle w:val="font-claude-response-body"/>
+      </w:pPr>
+      <w:r>
+        <w:t>That is a defensible answer to "where's the benchmark comparison," and it's the truthful one.</w:t>
+      </w:r>
+    </w:p>
+    <w:p>
+      <w:pPr>
+        <w:pStyle w:val="p2"/>
+        <w:jc w:val="both"/>
       </w:pPr>
     </w:p>
     <w:sectPr>
@@ -3633,6 +6460,155 @@
 <file path=word/numbering.xml><?xml version="1.0" encoding="utf-8"?>
 <w:numbering xmlns:wpc="http://schemas.microsoft.com/office/word/2010/wordprocessingCanvas" xmlns:cx="http://schemas.microsoft.com/office/drawing/2014/chartex" xmlns:cx1="http://schemas.microsoft.com/office/drawing/2015/9/8/chartex" xmlns:cx2="http://schemas.microsoft.com/office/drawing/2015/10/21/chartex" xmlns:cx3="http://schemas.microsoft.com/office/drawing/2016/5/9/chartex" xmlns:cx4="http://schemas.microsoft.com/office/drawing/2016/5/10/chartex" xmlns:cx5="http://schemas.microsoft.com/office/drawing/2016/5/11/chartex" xmlns:cx6="http://schemas.microsoft.com/office/drawing/2016/5/12/chartex" xmlns:cx7="http://schemas.microsoft.com/office/drawing/2016/5/13/chartex" xmlns:cx8="http://schemas.microsoft.com/office/drawing/2016/5/14/chartex" xmlns:mc="http://schemas.openxmlformats.org/markup-compatibility/2006" xmlns:aink="http://schemas.microsoft.com/office/drawing/2016/ink" xmlns:am3d="http://schemas.microsoft.com/office/drawing/2017/model3d" xmlns:o="urn:schemas-microsoft-com:office:office" xmlns:oel="http://schemas.microsoft.com/office/2019/extlst" xmlns:r="http://schemas.openxmlformats.org/officeDocument/2006/relationships" xmlns:m="http://schemas.openxmlformats.org/officeDocument/2006/math" xmlns:v="urn:schemas-microsoft-com:vml" xmlns:wp14="http://schemas.microsoft.com/office/word/2010/wordprocessingDrawing" xmlns:wp="http://schemas.openxmlformats.org/drawingml/2006/wordprocessingDrawing" xmlns:w10="urn:schemas-microsoft-com:office:word" xmlns:w="http://schemas.openxmlformats.org/wordprocessingml/2006/main" xmlns:w14="http://schemas.microsoft.com/office/word/2010/wordml" xmlns:w15="http://schemas.microsoft.com/office/word/2012/wordml" xmlns:w16cex="http://schemas.microsoft.com/office/word/2018/wordml/cex" xmlns:w16cid="http://schemas.microsoft.com/office/word/2016/wordml/cid" xmlns:w16="http://schemas.microsoft.com/office/word/2018/wordml" xmlns:w16du="http://schemas.microsoft.com/office/word/2023/wordml/word16du" xmlns:w16sdtdh="http://schemas.microsoft.com/office/word/2020/wordml/sdtdatahash" xmlns:w16sdtfl="http://schemas.microsoft.com/office/word/2024/wordml/sdtformatlock" xmlns:w16se="http://schemas.microsoft.com/office/word/2015/wordml/symex" xmlns:wpg="http://schemas.microsoft.com/office/word/2010/wordprocessingGroup" xmlns:wpi="http://schemas.microsoft.com/office/word/2010/wordprocessingInk" xmlns:wne="http://schemas.microsoft.com/office/word/2006/wordml" xmlns:wps="http://schemas.microsoft.com/office/word/2010/wordprocessingShape" mc:Ignorable="w14 w15 w16se w16cid w16 w16cex w16sdtdh w16sdtfl w16du wp14">
   <w:abstractNum w:abstractNumId="0" w15:restartNumberingAfterBreak="0">
+    <w:nsid w:val="006C5E8C"/>
+    <w:multiLevelType w:val="multilevel"/>
+    <w:tmpl w:val="B8F4E48A"/>
+    <w:lvl w:ilvl="0">
+      <w:start w:val="1"/>
+      <w:numFmt w:val="bullet"/>
+      <w:lvlText w:val=""/>
+      <w:lvlJc w:val="left"/>
+      <w:pPr>
+        <w:tabs>
+          <w:tab w:val="num" w:pos="720"/>
+        </w:tabs>
+        <w:ind w:left="720" w:hanging="360"/>
+      </w:pPr>
+      <w:rPr>
+        <w:rFonts w:ascii="Symbol" w:hAnsi="Symbol" w:hint="default"/>
+        <w:sz w:val="20"/>
+      </w:rPr>
+    </w:lvl>
+    <w:lvl w:ilvl="1" w:tentative="1">
+      <w:start w:val="1"/>
+      <w:numFmt w:val="bullet"/>
+      <w:lvlText w:val="o"/>
+      <w:lvlJc w:val="left"/>
+      <w:pPr>
+        <w:tabs>
+          <w:tab w:val="num" w:pos="1440"/>
+        </w:tabs>
+        <w:ind w:left="1440" w:hanging="360"/>
+      </w:pPr>
+      <w:rPr>
+        <w:rFonts w:ascii="Courier New" w:hAnsi="Courier New" w:hint="default"/>
+        <w:sz w:val="20"/>
+      </w:rPr>
+    </w:lvl>
+    <w:lvl w:ilvl="2" w:tentative="1">
+      <w:start w:val="1"/>
+      <w:numFmt w:val="bullet"/>
+      <w:lvlText w:val=""/>
+      <w:lvlJc w:val="left"/>
+      <w:pPr>
+        <w:tabs>
+          <w:tab w:val="num" w:pos="2160"/>
+        </w:tabs>
+        <w:ind w:left="2160" w:hanging="360"/>
+      </w:pPr>
+      <w:rPr>
+        <w:rFonts w:ascii="Wingdings" w:hAnsi="Wingdings" w:hint="default"/>
+        <w:sz w:val="20"/>
+      </w:rPr>
+    </w:lvl>
+    <w:lvl w:ilvl="3" w:tentative="1">
+      <w:start w:val="1"/>
+      <w:numFmt w:val="bullet"/>
+      <w:lvlText w:val=""/>
+      <w:lvlJc w:val="left"/>
+      <w:pPr>
+        <w:tabs>
+          <w:tab w:val="num" w:pos="2880"/>
+        </w:tabs>
+        <w:ind w:left="2880" w:hanging="360"/>
+      </w:pPr>
+      <w:rPr>
+        <w:rFonts w:ascii="Wingdings" w:hAnsi="Wingdings" w:hint="default"/>
+        <w:sz w:val="20"/>
+      </w:rPr>
+    </w:lvl>
+    <w:lvl w:ilvl="4" w:tentative="1">
+      <w:start w:val="1"/>
+      <w:numFmt w:val="bullet"/>
+      <w:lvlText w:val=""/>
+      <w:lvlJc w:val="left"/>
+      <w:pPr>
+        <w:tabs>
+          <w:tab w:val="num" w:pos="3600"/>
+        </w:tabs>
+        <w:ind w:left="3600" w:hanging="360"/>
+      </w:pPr>
+      <w:rPr>
+        <w:rFonts w:ascii="Wingdings" w:hAnsi="Wingdings" w:hint="default"/>
+        <w:sz w:val="20"/>
+      </w:rPr>
+    </w:lvl>
+    <w:lvl w:ilvl="5" w:tentative="1">
+      <w:start w:val="1"/>
+      <w:numFmt w:val="bullet"/>
+      <w:lvlText w:val=""/>
+      <w:lvlJc w:val="left"/>
+      <w:pPr>
+        <w:tabs>
+          <w:tab w:val="num" w:pos="4320"/>
+        </w:tabs>
+        <w:ind w:left="4320" w:hanging="360"/>
+      </w:pPr>
+      <w:rPr>
+        <w:rFonts w:ascii="Wingdings" w:hAnsi="Wingdings" w:hint="default"/>
+        <w:sz w:val="20"/>
+      </w:rPr>
+    </w:lvl>
+    <w:lvl w:ilvl="6" w:tentative="1">
+      <w:start w:val="1"/>
+      <w:numFmt w:val="bullet"/>
+      <w:lvlText w:val=""/>
+      <w:lvlJc w:val="left"/>
+      <w:pPr>
+        <w:tabs>
+          <w:tab w:val="num" w:pos="5040"/>
+        </w:tabs>
+        <w:ind w:left="5040" w:hanging="360"/>
+      </w:pPr>
+      <w:rPr>
+        <w:rFonts w:ascii="Wingdings" w:hAnsi="Wingdings" w:hint="default"/>
+        <w:sz w:val="20"/>
+      </w:rPr>
+    </w:lvl>
+    <w:lvl w:ilvl="7" w:tentative="1">
+      <w:start w:val="1"/>
+      <w:numFmt w:val="bullet"/>
+      <w:lvlText w:val=""/>
+      <w:lvlJc w:val="left"/>
+      <w:pPr>
+        <w:tabs>
+          <w:tab w:val="num" w:pos="5760"/>
+        </w:tabs>
+        <w:ind w:left="5760" w:hanging="360"/>
+      </w:pPr>
+      <w:rPr>
+        <w:rFonts w:ascii="Wingdings" w:hAnsi="Wingdings" w:hint="default"/>
+        <w:sz w:val="20"/>
+      </w:rPr>
+    </w:lvl>
+    <w:lvl w:ilvl="8" w:tentative="1">
+      <w:start w:val="1"/>
+      <w:numFmt w:val="bullet"/>
+      <w:lvlText w:val=""/>
+      <w:lvlJc w:val="left"/>
+      <w:pPr>
+        <w:tabs>
+          <w:tab w:val="num" w:pos="6480"/>
+        </w:tabs>
+        <w:ind w:left="6480" w:hanging="360"/>
+      </w:pPr>
+      <w:rPr>
+        <w:rFonts w:ascii="Wingdings" w:hAnsi="Wingdings" w:hint="default"/>
+        <w:sz w:val="20"/>
+      </w:rPr>
+    </w:lvl>
+  </w:abstractNum>
+  <w:abstractNum w:abstractNumId="1" w15:restartNumberingAfterBreak="0">
     <w:nsid w:val="07A31BA1"/>
     <w:multiLevelType w:val="multilevel"/>
     <w:tmpl w:val="705E3234"/>
@@ -3781,7 +6757,7 @@
       </w:rPr>
     </w:lvl>
   </w:abstractNum>
-  <w:abstractNum w:abstractNumId="1" w15:restartNumberingAfterBreak="0">
+  <w:abstractNum w:abstractNumId="2" w15:restartNumberingAfterBreak="0">
     <w:nsid w:val="0EEB0A8C"/>
     <w:multiLevelType w:val="hybridMultilevel"/>
     <w:tmpl w:val="D3864AEE"/>
@@ -3870,7 +6846,7 @@
       </w:pPr>
     </w:lvl>
   </w:abstractNum>
-  <w:abstractNum w:abstractNumId="2" w15:restartNumberingAfterBreak="0">
+  <w:abstractNum w:abstractNumId="3" w15:restartNumberingAfterBreak="0">
     <w:nsid w:val="11E35C92"/>
     <w:multiLevelType w:val="multilevel"/>
     <w:tmpl w:val="506E061C"/>
@@ -4019,7 +6995,7 @@
       </w:rPr>
     </w:lvl>
   </w:abstractNum>
-  <w:abstractNum w:abstractNumId="3" w15:restartNumberingAfterBreak="0">
+  <w:abstractNum w:abstractNumId="4" w15:restartNumberingAfterBreak="0">
     <w:nsid w:val="16574E7B"/>
     <w:multiLevelType w:val="multilevel"/>
     <w:tmpl w:val="12D6DEF4"/>
@@ -4132,7 +7108,7 @@
       </w:pPr>
     </w:lvl>
   </w:abstractNum>
-  <w:abstractNum w:abstractNumId="4" w15:restartNumberingAfterBreak="0">
+  <w:abstractNum w:abstractNumId="5" w15:restartNumberingAfterBreak="0">
     <w:nsid w:val="2E983105"/>
     <w:multiLevelType w:val="multilevel"/>
     <w:tmpl w:val="7D8E5410"/>
@@ -4281,7 +7257,120 @@
       </w:rPr>
     </w:lvl>
   </w:abstractNum>
-  <w:abstractNum w:abstractNumId="5" w15:restartNumberingAfterBreak="0">
+  <w:abstractNum w:abstractNumId="6" w15:restartNumberingAfterBreak="0">
+    <w:nsid w:val="323E360F"/>
+    <w:multiLevelType w:val="multilevel"/>
+    <w:tmpl w:val="51ACA784"/>
+    <w:lvl w:ilvl="0">
+      <w:start w:val="1"/>
+      <w:numFmt w:val="decimal"/>
+      <w:lvlText w:val="%1."/>
+      <w:lvlJc w:val="left"/>
+      <w:pPr>
+        <w:tabs>
+          <w:tab w:val="num" w:pos="720"/>
+        </w:tabs>
+        <w:ind w:left="720" w:hanging="360"/>
+      </w:pPr>
+    </w:lvl>
+    <w:lvl w:ilvl="1" w:tentative="1">
+      <w:start w:val="1"/>
+      <w:numFmt w:val="decimal"/>
+      <w:lvlText w:val="%2."/>
+      <w:lvlJc w:val="left"/>
+      <w:pPr>
+        <w:tabs>
+          <w:tab w:val="num" w:pos="1440"/>
+        </w:tabs>
+        <w:ind w:left="1440" w:hanging="360"/>
+      </w:pPr>
+    </w:lvl>
+    <w:lvl w:ilvl="2" w:tentative="1">
+      <w:start w:val="1"/>
+      <w:numFmt w:val="decimal"/>
+      <w:lvlText w:val="%3."/>
+      <w:lvlJc w:val="left"/>
+      <w:pPr>
+        <w:tabs>
+          <w:tab w:val="num" w:pos="2160"/>
+        </w:tabs>
+        <w:ind w:left="2160" w:hanging="360"/>
+      </w:pPr>
+    </w:lvl>
+    <w:lvl w:ilvl="3" w:tentative="1">
+      <w:start w:val="1"/>
+      <w:numFmt w:val="decimal"/>
+      <w:lvlText w:val="%4."/>
+      <w:lvlJc w:val="left"/>
+      <w:pPr>
+        <w:tabs>
+          <w:tab w:val="num" w:pos="2880"/>
+        </w:tabs>
+        <w:ind w:left="2880" w:hanging="360"/>
+      </w:pPr>
+    </w:lvl>
+    <w:lvl w:ilvl="4" w:tentative="1">
+      <w:start w:val="1"/>
+      <w:numFmt w:val="decimal"/>
+      <w:lvlText w:val="%5."/>
+      <w:lvlJc w:val="left"/>
+      <w:pPr>
+        <w:tabs>
+          <w:tab w:val="num" w:pos="3600"/>
+        </w:tabs>
+        <w:ind w:left="3600" w:hanging="360"/>
+      </w:pPr>
+    </w:lvl>
+    <w:lvl w:ilvl="5" w:tentative="1">
+      <w:start w:val="1"/>
+      <w:numFmt w:val="decimal"/>
+      <w:lvlText w:val="%6."/>
+      <w:lvlJc w:val="left"/>
+      <w:pPr>
+        <w:tabs>
+          <w:tab w:val="num" w:pos="4320"/>
+        </w:tabs>
+        <w:ind w:left="4320" w:hanging="360"/>
+      </w:pPr>
+    </w:lvl>
+    <w:lvl w:ilvl="6" w:tentative="1">
+      <w:start w:val="1"/>
+      <w:numFmt w:val="decimal"/>
+      <w:lvlText w:val="%7."/>
+      <w:lvlJc w:val="left"/>
+      <w:pPr>
+        <w:tabs>
+          <w:tab w:val="num" w:pos="5040"/>
+        </w:tabs>
+        <w:ind w:left="5040" w:hanging="360"/>
+      </w:pPr>
+    </w:lvl>
+    <w:lvl w:ilvl="7" w:tentative="1">
+      <w:start w:val="1"/>
+      <w:numFmt w:val="decimal"/>
+      <w:lvlText w:val="%8."/>
+      <w:lvlJc w:val="left"/>
+      <w:pPr>
+        <w:tabs>
+          <w:tab w:val="num" w:pos="5760"/>
+        </w:tabs>
+        <w:ind w:left="5760" w:hanging="360"/>
+      </w:pPr>
+    </w:lvl>
+    <w:lvl w:ilvl="8" w:tentative="1">
+      <w:start w:val="1"/>
+      <w:numFmt w:val="decimal"/>
+      <w:lvlText w:val="%9."/>
+      <w:lvlJc w:val="left"/>
+      <w:pPr>
+        <w:tabs>
+          <w:tab w:val="num" w:pos="6480"/>
+        </w:tabs>
+        <w:ind w:left="6480" w:hanging="360"/>
+      </w:pPr>
+    </w:lvl>
+  </w:abstractNum>
+  <w:abstractNum w:abstractNumId="7" w15:restartNumberingAfterBreak="0">
     <w:nsid w:val="346F33EF"/>
     <w:multiLevelType w:val="multilevel"/>
     <w:tmpl w:val="0588942A"/>
@@ -4430,7 +7519,7 @@
       </w:rPr>
     </w:lvl>
   </w:abstractNum>
-  <w:abstractNum w:abstractNumId="6" w15:restartNumberingAfterBreak="0">
+  <w:abstractNum w:abstractNumId="8" w15:restartNumberingAfterBreak="0">
     <w:nsid w:val="34DA3B4B"/>
     <w:multiLevelType w:val="multilevel"/>
     <w:tmpl w:val="C40CA326"/>
@@ -4579,7 +7668,7 @@
       </w:rPr>
     </w:lvl>
   </w:abstractNum>
-  <w:abstractNum w:abstractNumId="7" w15:restartNumberingAfterBreak="0">
+  <w:abstractNum w:abstractNumId="9" w15:restartNumberingAfterBreak="0">
     <w:nsid w:val="39AF25AA"/>
     <w:multiLevelType w:val="multilevel"/>
     <w:tmpl w:val="4D426E82"/>
@@ -4728,7 +7817,7 @@
       </w:rPr>
     </w:lvl>
   </w:abstractNum>
-  <w:abstractNum w:abstractNumId="8" w15:restartNumberingAfterBreak="0">
+  <w:abstractNum w:abstractNumId="10" w15:restartNumberingAfterBreak="0">
     <w:nsid w:val="4138368E"/>
     <w:multiLevelType w:val="hybridMultilevel"/>
     <w:tmpl w:val="43520EF2"/>
@@ -4817,7 +7906,305 @@
       </w:pPr>
     </w:lvl>
   </w:abstractNum>
-  <w:abstractNum w:abstractNumId="9" w15:restartNumberingAfterBreak="0">
+  <w:abstractNum w:abstractNumId="11" w15:restartNumberingAfterBreak="0">
+    <w:nsid w:val="49976322"/>
+    <w:multiLevelType w:val="multilevel"/>
+    <w:tmpl w:val="9D5E89C2"/>
+    <w:lvl w:ilvl="0">
+      <w:start w:val="1"/>
+      <w:numFmt w:val="bullet"/>
+      <w:lvlText w:val=""/>
+      <w:lvlJc w:val="left"/>
+      <w:pPr>
+        <w:tabs>
+          <w:tab w:val="num" w:pos="720"/>
+        </w:tabs>
+        <w:ind w:left="720" w:hanging="360"/>
+      </w:pPr>
+      <w:rPr>
+        <w:rFonts w:ascii="Symbol" w:hAnsi="Symbol" w:hint="default"/>
+        <w:sz w:val="20"/>
+      </w:rPr>
+    </w:lvl>
+    <w:lvl w:ilvl="1" w:tentative="1">
+      <w:start w:val="1"/>
+      <w:numFmt w:val="bullet"/>
+      <w:lvlText w:val="o"/>
+      <w:lvlJc w:val="left"/>
+      <w:pPr>
+        <w:tabs>
+          <w:tab w:val="num" w:pos="1440"/>
+        </w:tabs>
+        <w:ind w:left="1440" w:hanging="360"/>
+      </w:pPr>
+      <w:rPr>
+        <w:rFonts w:ascii="Courier New" w:hAnsi="Courier New" w:hint="default"/>
+        <w:sz w:val="20"/>
+      </w:rPr>
+    </w:lvl>
+    <w:lvl w:ilvl="2" w:tentative="1">
+      <w:start w:val="1"/>
+      <w:numFmt w:val="bullet"/>
+      <w:lvlText w:val=""/>
+      <w:lvlJc w:val="left"/>
+      <w:pPr>
+        <w:tabs>
+          <w:tab w:val="num" w:pos="2160"/>
+        </w:tabs>
+        <w:ind w:left="2160" w:hanging="360"/>
+      </w:pPr>
+      <w:rPr>
+        <w:rFonts w:ascii="Wingdings" w:hAnsi="Wingdings" w:hint="default"/>
+        <w:sz w:val="20"/>
+      </w:rPr>
+    </w:lvl>
+    <w:lvl w:ilvl="3" w:tentative="1">
+      <w:start w:val="1"/>
+      <w:numFmt w:val="bullet"/>
+      <w:lvlText w:val=""/>
+      <w:lvlJc w:val="left"/>
+      <w:pPr>
+        <w:tabs>
+          <w:tab w:val="num" w:pos="2880"/>
+        </w:tabs>
+        <w:ind w:left="2880" w:hanging="360"/>
+      </w:pPr>
+      <w:rPr>
+        <w:rFonts w:ascii="Wingdings" w:hAnsi="Wingdings" w:hint="default"/>
+        <w:sz w:val="20"/>
+      </w:rPr>
+    </w:lvl>
+    <w:lvl w:ilvl="4" w:tentative="1">
+      <w:start w:val="1"/>
+      <w:numFmt w:val="bullet"/>
+      <w:lvlText w:val=""/>
+      <w:lvlJc w:val="left"/>
+      <w:pPr>
+        <w:tabs>
+          <w:tab w:val="num" w:pos="3600"/>
+        </w:tabs>
+        <w:ind w:left="3600" w:hanging="360"/>
+      </w:pPr>
+      <w:rPr>
+        <w:rFonts w:ascii="Wingdings" w:hAnsi="Wingdings" w:hint="default"/>
+        <w:sz w:val="20"/>
+      </w:rPr>
+    </w:lvl>
+    <w:lvl w:ilvl="5" w:tentative="1">
+      <w:start w:val="1"/>
+      <w:numFmt w:val="bullet"/>
+      <w:lvlText w:val=""/>
+      <w:lvlJc w:val="left"/>
+      <w:pPr>
+        <w:tabs>
+          <w:tab w:val="num" w:pos="4320"/>
+        </w:tabs>
+        <w:ind w:left="4320" w:hanging="360"/>
+      </w:pPr>
+      <w:rPr>
+        <w:rFonts w:ascii="Wingdings" w:hAnsi="Wingdings" w:hint="default"/>
+        <w:sz w:val="20"/>
+      </w:rPr>
+    </w:lvl>
+    <w:lvl w:ilvl="6" w:tentative="1">
+      <w:start w:val="1"/>
+      <w:numFmt w:val="bullet"/>
+      <w:lvlText w:val=""/>
+      <w:lvlJc w:val="left"/>
+      <w:pPr>
+        <w:tabs>
+          <w:tab w:val="num" w:pos="5040"/>
+        </w:tabs>
+        <w:ind w:left="5040" w:hanging="360"/>
+      </w:pPr>
+      <w:rPr>
+        <w:rFonts w:ascii="Wingdings" w:hAnsi="Wingdings" w:hint="default"/>
+        <w:sz w:val="20"/>
+      </w:rPr>
+    </w:lvl>
+    <w:lvl w:ilvl="7" w:tentative="1">
+      <w:start w:val="1"/>
+      <w:numFmt w:val="bullet"/>
+      <w:lvlText w:val=""/>
+      <w:lvlJc w:val="left"/>
+      <w:pPr>
+        <w:tabs>
+          <w:tab w:val="num" w:pos="5760"/>
+        </w:tabs>
+        <w:ind w:left="5760" w:hanging="360"/>
+      </w:pPr>
+      <w:rPr>
+        <w:rFonts w:ascii="Wingdings" w:hAnsi="Wingdings" w:hint="default"/>
+        <w:sz w:val="20"/>
+      </w:rPr>
+    </w:lvl>
+    <w:lvl w:ilvl="8" w:tentative="1">
+      <w:start w:val="1"/>
+      <w:numFmt w:val="bullet"/>
+      <w:lvlText w:val=""/>
+      <w:lvlJc w:val="left"/>
+      <w:pPr>
+        <w:tabs>
+          <w:tab w:val="num" w:pos="6480"/>
+        </w:tabs>
+        <w:ind w:left="6480" w:hanging="360"/>
+      </w:pPr>
+      <w:rPr>
+        <w:rFonts w:ascii="Wingdings" w:hAnsi="Wingdings" w:hint="default"/>
+        <w:sz w:val="20"/>
+      </w:rPr>
+    </w:lvl>
+  </w:abstractNum>
+  <w:abstractNum w:abstractNumId="12" w15:restartNumberingAfterBreak="0">
+    <w:nsid w:val="4B181911"/>
+    <w:multiLevelType w:val="multilevel"/>
+    <w:tmpl w:val="88CA407A"/>
+    <w:lvl w:ilvl="0">
+      <w:start w:val="1"/>
+      <w:numFmt w:val="bullet"/>
+      <w:lvlText w:val=""/>
+      <w:lvlJc w:val="left"/>
+      <w:pPr>
+        <w:tabs>
+          <w:tab w:val="num" w:pos="720"/>
+        </w:tabs>
+        <w:ind w:left="720" w:hanging="360"/>
+      </w:pPr>
+      <w:rPr>
+        <w:rFonts w:ascii="Symbol" w:hAnsi="Symbol" w:hint="default"/>
+        <w:sz w:val="20"/>
+      </w:rPr>
+    </w:lvl>
+    <w:lvl w:ilvl="1" w:tentative="1">
+      <w:start w:val="1"/>
+      <w:numFmt w:val="bullet"/>
+      <w:lvlText w:val="o"/>
+      <w:lvlJc w:val="left"/>
+      <w:pPr>
+        <w:tabs>
+          <w:tab w:val="num" w:pos="1440"/>
+        </w:tabs>
+        <w:ind w:left="1440" w:hanging="360"/>
+      </w:pPr>
+      <w:rPr>
+        <w:rFonts w:ascii="Courier New" w:hAnsi="Courier New" w:hint="default"/>
+        <w:sz w:val="20"/>
+      </w:rPr>
+    </w:lvl>
+    <w:lvl w:ilvl="2" w:tentative="1">
+      <w:start w:val="1"/>
+      <w:numFmt w:val="bullet"/>
+      <w:lvlText w:val=""/>
+      <w:lvlJc w:val="left"/>
+      <w:pPr>
+        <w:tabs>
+          <w:tab w:val="num" w:pos="2160"/>
+        </w:tabs>
+        <w:ind w:left="2160" w:hanging="360"/>
+      </w:pPr>
+      <w:rPr>
+        <w:rFonts w:ascii="Wingdings" w:hAnsi="Wingdings" w:hint="default"/>
+        <w:sz w:val="20"/>
+      </w:rPr>
+    </w:lvl>
+    <w:lvl w:ilvl="3" w:tentative="1">
+      <w:start w:val="1"/>
+      <w:numFmt w:val="bullet"/>
+      <w:lvlText w:val=""/>
+      <w:lvlJc w:val="left"/>
+      <w:pPr>
+        <w:tabs>
+          <w:tab w:val="num" w:pos="2880"/>
+        </w:tabs>
+        <w:ind w:left="2880" w:hanging="360"/>
+      </w:pPr>
+      <w:rPr>
+        <w:rFonts w:ascii="Wingdings" w:hAnsi="Wingdings" w:hint="default"/>
+        <w:sz w:val="20"/>
+      </w:rPr>
+    </w:lvl>
+    <w:lvl w:ilvl="4" w:tentative="1">
+      <w:start w:val="1"/>
+      <w:numFmt w:val="bullet"/>
+      <w:lvlText w:val=""/>
+      <w:lvlJc w:val="left"/>
+      <w:pPr>
+        <w:tabs>
+          <w:tab w:val="num" w:pos="3600"/>
+        </w:tabs>
+        <w:ind w:left="3600" w:hanging="360"/>
+      </w:pPr>
+      <w:rPr>
+        <w:rFonts w:ascii="Wingdings" w:hAnsi="Wingdings" w:hint="default"/>
+        <w:sz w:val="20"/>
+      </w:rPr>
+    </w:lvl>
+    <w:lvl w:ilvl="5" w:tentative="1">
+      <w:start w:val="1"/>
+      <w:numFmt w:val="bullet"/>
+      <w:lvlText w:val=""/>
+      <w:lvlJc w:val="left"/>
+      <w:pPr>
+        <w:tabs>
+          <w:tab w:val="num" w:pos="4320"/>
+        </w:tabs>
+        <w:ind w:left="4320" w:hanging="360"/>
+      </w:pPr>
+      <w:rPr>
+        <w:rFonts w:ascii="Wingdings" w:hAnsi="Wingdings" w:hint="default"/>
+        <w:sz w:val="20"/>
+      </w:rPr>
+    </w:lvl>
+    <w:lvl w:ilvl="6" w:tentative="1">
+      <w:start w:val="1"/>
+      <w:numFmt w:val="bullet"/>
+      <w:lvlText w:val=""/>
+      <w:lvlJc w:val="left"/>
+      <w:pPr>
+        <w:tabs>
+          <w:tab w:val="num" w:pos="5040"/>
+        </w:tabs>
+        <w:ind w:left="5040" w:hanging="360"/>
+      </w:pPr>
+      <w:rPr>
+        <w:rFonts w:ascii="Wingdings" w:hAnsi="Wingdings" w:hint="default"/>
+        <w:sz w:val="20"/>
+      </w:rPr>
+    </w:lvl>
+    <w:lvl w:ilvl="7" w:tentative="1">
+      <w:start w:val="1"/>
+      <w:numFmt w:val="bullet"/>
+      <w:lvlText w:val=""/>
+      <w:lvlJc w:val="left"/>
+      <w:pPr>
+        <w:tabs>
+          <w:tab w:val="num" w:pos="5760"/>
+        </w:tabs>
+        <w:ind w:left="5760" w:hanging="360"/>
+      </w:pPr>
+      <w:rPr>
+        <w:rFonts w:ascii="Wingdings" w:hAnsi="Wingdings" w:hint="default"/>
+        <w:sz w:val="20"/>
+      </w:rPr>
+    </w:lvl>
+    <w:lvl w:ilvl="8" w:tentative="1">
+      <w:start w:val="1"/>
+      <w:numFmt w:val="bullet"/>
+      <w:lvlText w:val=""/>
+      <w:lvlJc w:val="left"/>
+      <w:pPr>
+        <w:tabs>
+          <w:tab w:val="num" w:pos="6480"/>
+        </w:tabs>
+        <w:ind w:left="6480" w:hanging="360"/>
+      </w:pPr>
+      <w:rPr>
+        <w:rFonts w:ascii="Wingdings" w:hAnsi="Wingdings" w:hint="default"/>
+        <w:sz w:val="20"/>
+      </w:rPr>
+    </w:lvl>
+  </w:abstractNum>
+  <w:abstractNum w:abstractNumId="13" w15:restartNumberingAfterBreak="0">
     <w:nsid w:val="536C2F03"/>
     <w:multiLevelType w:val="multilevel"/>
     <w:tmpl w:val="9B56C2FA"/>
@@ -4966,7 +8353,7 @@
       </w:rPr>
     </w:lvl>
   </w:abstractNum>
-  <w:abstractNum w:abstractNumId="10" w15:restartNumberingAfterBreak="0">
+  <w:abstractNum w:abstractNumId="14" w15:restartNumberingAfterBreak="0">
     <w:nsid w:val="55793F92"/>
     <w:multiLevelType w:val="multilevel"/>
     <w:tmpl w:val="0874986C"/>
@@ -5115,7 +8502,7 @@
       </w:rPr>
     </w:lvl>
   </w:abstractNum>
-  <w:abstractNum w:abstractNumId="11" w15:restartNumberingAfterBreak="0">
+  <w:abstractNum w:abstractNumId="15" w15:restartNumberingAfterBreak="0">
     <w:nsid w:val="58516A4D"/>
     <w:multiLevelType w:val="multilevel"/>
     <w:tmpl w:val="B7B2B0B8"/>
@@ -5264,7 +8651,7 @@
       </w:rPr>
     </w:lvl>
   </w:abstractNum>
-  <w:abstractNum w:abstractNumId="12" w15:restartNumberingAfterBreak="0">
+  <w:abstractNum w:abstractNumId="16" w15:restartNumberingAfterBreak="0">
     <w:nsid w:val="5C305800"/>
     <w:multiLevelType w:val="hybridMultilevel"/>
     <w:tmpl w:val="ACD013BA"/>
@@ -5377,7 +8764,7 @@
       </w:rPr>
     </w:lvl>
   </w:abstractNum>
-  <w:abstractNum w:abstractNumId="13" w15:restartNumberingAfterBreak="0">
+  <w:abstractNum w:abstractNumId="17" w15:restartNumberingAfterBreak="0">
     <w:nsid w:val="60E758F7"/>
     <w:multiLevelType w:val="multilevel"/>
     <w:tmpl w:val="8A321376"/>
@@ -5526,7 +8913,7 @@
       </w:rPr>
     </w:lvl>
   </w:abstractNum>
-  <w:abstractNum w:abstractNumId="14" w15:restartNumberingAfterBreak="0">
+  <w:abstractNum w:abstractNumId="18" w15:restartNumberingAfterBreak="0">
     <w:nsid w:val="61937E01"/>
     <w:multiLevelType w:val="multilevel"/>
     <w:tmpl w:val="69880E10"/>
@@ -5675,7 +9062,120 @@
       </w:rPr>
     </w:lvl>
   </w:abstractNum>
-  <w:abstractNum w:abstractNumId="15" w15:restartNumberingAfterBreak="0">
+  <w:abstractNum w:abstractNumId="19" w15:restartNumberingAfterBreak="0">
+    <w:nsid w:val="62906857"/>
+    <w:multiLevelType w:val="multilevel"/>
+    <w:tmpl w:val="1C00AC7E"/>
+    <w:lvl w:ilvl="0">
+      <w:start w:val="1"/>
+      <w:numFmt w:val="decimal"/>
+      <w:lvlText w:val="%1."/>
+      <w:lvlJc w:val="left"/>
+      <w:pPr>
+        <w:tabs>
+          <w:tab w:val="num" w:pos="720"/>
+        </w:tabs>
+        <w:ind w:left="720" w:hanging="360"/>
+      </w:pPr>
+    </w:lvl>
+    <w:lvl w:ilvl="1" w:tentative="1">
+      <w:start w:val="1"/>
+      <w:numFmt w:val="decimal"/>
+      <w:lvlText w:val="%2."/>
+      <w:lvlJc w:val="left"/>
+      <w:pPr>
+        <w:tabs>
+          <w:tab w:val="num" w:pos="1440"/>
+        </w:tabs>
+        <w:ind w:left="1440" w:hanging="360"/>
+      </w:pPr>
+    </w:lvl>
+    <w:lvl w:ilvl="2" w:tentative="1">
+      <w:start w:val="1"/>
+      <w:numFmt w:val="decimal"/>
+      <w:lvlText w:val="%3."/>
+      <w:lvlJc w:val="left"/>
+      <w:pPr>
+        <w:tabs>
+          <w:tab w:val="num" w:pos="2160"/>
+        </w:tabs>
+        <w:ind w:left="2160" w:hanging="360"/>
+      </w:pPr>
+    </w:lvl>
+    <w:lvl w:ilvl="3" w:tentative="1">
+      <w:start w:val="1"/>
+      <w:numFmt w:val="decimal"/>
+      <w:lvlText w:val="%4."/>
+      <w:lvlJc w:val="left"/>
+      <w:pPr>
+        <w:tabs>
+          <w:tab w:val="num" w:pos="2880"/>
+        </w:tabs>
+        <w:ind w:left="2880" w:hanging="360"/>
+      </w:pPr>
+    </w:lvl>
+    <w:lvl w:ilvl="4" w:tentative="1">
+      <w:start w:val="1"/>
+      <w:numFmt w:val="decimal"/>
+      <w:lvlText w:val="%5."/>
+      <w:lvlJc w:val="left"/>
+      <w:pPr>
+        <w:tabs>
+          <w:tab w:val="num" w:pos="3600"/>
+        </w:tabs>
+        <w:ind w:left="3600" w:hanging="360"/>
+      </w:pPr>
+    </w:lvl>
+    <w:lvl w:ilvl="5" w:tentative="1">
+      <w:start w:val="1"/>
+      <w:numFmt w:val="decimal"/>
+      <w:lvlText w:val="%6."/>
+      <w:lvlJc w:val="left"/>
+      <w:pPr>
+        <w:tabs>
+          <w:tab w:val="num" w:pos="4320"/>
+        </w:tabs>
+        <w:ind w:left="4320" w:hanging="360"/>
+      </w:pPr>
+    </w:lvl>
+    <w:lvl w:ilvl="6" w:tentative="1">
+      <w:start w:val="1"/>
+      <w:numFmt w:val="decimal"/>
+      <w:lvlText w:val="%7."/>
+      <w:lvlJc w:val="left"/>
+      <w:pPr>
+        <w:tabs>
+          <w:tab w:val="num" w:pos="5040"/>
+        </w:tabs>
+        <w:ind w:left="5040" w:hanging="360"/>
+      </w:pPr>
+    </w:lvl>
+    <w:lvl w:ilvl="7" w:tentative="1">
+      <w:start w:val="1"/>
+      <w:numFmt w:val="decimal"/>
+      <w:lvlText w:val="%8."/>
+      <w:lvlJc w:val="left"/>
+      <w:pPr>
+        <w:tabs>
+          <w:tab w:val="num" w:pos="5760"/>
+        </w:tabs>
+        <w:ind w:left="5760" w:hanging="360"/>
+      </w:pPr>
+    </w:lvl>
+    <w:lvl w:ilvl="8" w:tentative="1">
+      <w:start w:val="1"/>
+      <w:numFmt w:val="decimal"/>
+      <w:lvlText w:val="%9."/>
+      <w:lvlJc w:val="left"/>
+      <w:pPr>
+        <w:tabs>
+          <w:tab w:val="num" w:pos="6480"/>
+        </w:tabs>
+        <w:ind w:left="6480" w:hanging="360"/>
+      </w:pPr>
+    </w:lvl>
+  </w:abstractNum>
+  <w:abstractNum w:abstractNumId="20" w15:restartNumberingAfterBreak="0">
     <w:nsid w:val="6B6A093B"/>
     <w:multiLevelType w:val="multilevel"/>
     <w:tmpl w:val="81784F12"/>
@@ -5824,7 +9324,7 @@
       </w:rPr>
     </w:lvl>
   </w:abstractNum>
-  <w:abstractNum w:abstractNumId="16" w15:restartNumberingAfterBreak="0">
+  <w:abstractNum w:abstractNumId="21" w15:restartNumberingAfterBreak="0">
     <w:nsid w:val="6C2819A7"/>
     <w:multiLevelType w:val="multilevel"/>
     <w:tmpl w:val="B6AEE590"/>
@@ -5973,7 +9473,7 @@
       </w:rPr>
     </w:lvl>
   </w:abstractNum>
-  <w:abstractNum w:abstractNumId="17" w15:restartNumberingAfterBreak="0">
+  <w:abstractNum w:abstractNumId="22" w15:restartNumberingAfterBreak="0">
     <w:nsid w:val="6CED13D2"/>
     <w:multiLevelType w:val="hybridMultilevel"/>
     <w:tmpl w:val="BB8C7226"/>
@@ -6062,7 +9562,7 @@
       </w:pPr>
     </w:lvl>
   </w:abstractNum>
-  <w:abstractNum w:abstractNumId="18" w15:restartNumberingAfterBreak="0">
+  <w:abstractNum w:abstractNumId="23" w15:restartNumberingAfterBreak="0">
     <w:nsid w:val="7CF21BB9"/>
     <w:multiLevelType w:val="hybridMultilevel"/>
     <w:tmpl w:val="DDD858BC"/>
@@ -6176,61 +9676,76 @@
     </w:lvl>
   </w:abstractNum>
   <w:num w:numId="1" w16cid:durableId="371155226">
+    <w:abstractNumId w:val="22"/>
+  </w:num>
+  <w:num w:numId="2" w16cid:durableId="844435729">
+    <w:abstractNumId w:val="2"/>
+  </w:num>
+  <w:num w:numId="3" w16cid:durableId="763040087">
+    <w:abstractNumId w:val="8"/>
+  </w:num>
+  <w:num w:numId="4" w16cid:durableId="1555235216">
+    <w:abstractNumId w:val="18"/>
+  </w:num>
+  <w:num w:numId="5" w16cid:durableId="2115006890">
+    <w:abstractNumId w:val="20"/>
+  </w:num>
+  <w:num w:numId="6" w16cid:durableId="197276645">
     <w:abstractNumId w:val="17"/>
   </w:num>
-  <w:num w:numId="2" w16cid:durableId="844435729">
+  <w:num w:numId="7" w16cid:durableId="533691685">
     <w:abstractNumId w:val="1"/>
   </w:num>
-  <w:num w:numId="3" w16cid:durableId="763040087">
+  <w:num w:numId="8" w16cid:durableId="1181286555">
+    <w:abstractNumId w:val="13"/>
+  </w:num>
+  <w:num w:numId="9" w16cid:durableId="2144420518">
+    <w:abstractNumId w:val="14"/>
+  </w:num>
+  <w:num w:numId="10" w16cid:durableId="2020233439">
+    <w:abstractNumId w:val="4"/>
+  </w:num>
+  <w:num w:numId="11" w16cid:durableId="1406684459">
+    <w:abstractNumId w:val="7"/>
+  </w:num>
+  <w:num w:numId="12" w16cid:durableId="631180796">
+    <w:abstractNumId w:val="5"/>
+  </w:num>
+  <w:num w:numId="13" w16cid:durableId="1280063829">
+    <w:abstractNumId w:val="23"/>
+  </w:num>
+  <w:num w:numId="14" w16cid:durableId="969677255">
+    <w:abstractNumId w:val="21"/>
+  </w:num>
+  <w:num w:numId="15" w16cid:durableId="2106151938">
+    <w:abstractNumId w:val="15"/>
+  </w:num>
+  <w:num w:numId="16" w16cid:durableId="118577662">
+    <w:abstractNumId w:val="10"/>
+  </w:num>
+  <w:num w:numId="17" w16cid:durableId="1801607307">
+    <w:abstractNumId w:val="9"/>
+  </w:num>
+  <w:num w:numId="18" w16cid:durableId="1754743292">
+    <w:abstractNumId w:val="3"/>
+  </w:num>
+  <w:num w:numId="19" w16cid:durableId="538474742">
+    <w:abstractNumId w:val="16"/>
+  </w:num>
+  <w:num w:numId="20" w16cid:durableId="1903128492">
     <w:abstractNumId w:val="6"/>
   </w:num>
-  <w:num w:numId="4" w16cid:durableId="1555235216">
-    <w:abstractNumId w:val="14"/>
-  </w:num>
-  <w:num w:numId="5" w16cid:durableId="2115006890">
-    <w:abstractNumId w:val="15"/>
-  </w:num>
-  <w:num w:numId="6" w16cid:durableId="197276645">
-    <w:abstractNumId w:val="13"/>
-  </w:num>
-  <w:num w:numId="7" w16cid:durableId="533691685">
+  <w:num w:numId="21" w16cid:durableId="420880533">
     <w:abstractNumId w:val="0"/>
   </w:num>
-  <w:num w:numId="8" w16cid:durableId="1181286555">
-    <w:abstractNumId w:val="9"/>
+  <w:num w:numId="22" w16cid:durableId="231620877">
+    <w:abstractNumId w:val="12"/>
   </w:num>
-  <w:num w:numId="9" w16cid:durableId="2144420518">
-    <w:abstractNumId w:val="10"/>
-  </w:num>
-  <w:num w:numId="10" w16cid:durableId="2020233439">
-    <w:abstractNumId w:val="3"/>
-  </w:num>
-  <w:num w:numId="11" w16cid:durableId="1406684459">
-    <w:abstractNumId w:val="5"/>
-  </w:num>
-  <w:num w:numId="12" w16cid:durableId="631180796">
-    <w:abstractNumId w:val="4"/>
-  </w:num>
-  <w:num w:numId="13" w16cid:durableId="1280063829">
-    <w:abstractNumId w:val="18"/>
-  </w:num>
-  <w:num w:numId="14" w16cid:durableId="969677255">
-    <w:abstractNumId w:val="16"/>
-  </w:num>
-  <w:num w:numId="15" w16cid:durableId="2106151938">
+  <w:num w:numId="23" w16cid:durableId="1006522665">
     <w:abstractNumId w:val="11"/>
   </w:num>
-  <w:num w:numId="16" w16cid:durableId="118577662">
-    <w:abstractNumId w:val="8"/>
-  </w:num>
-  <w:num w:numId="17" w16cid:durableId="1801607307">
-    <w:abstractNumId w:val="7"/>
-  </w:num>
-  <w:num w:numId="18" w16cid:durableId="1754743292">
-    <w:abstractNumId w:val="2"/>
-  </w:num>
-  <w:num w:numId="19" w16cid:durableId="538474742">
-    <w:abstractNumId w:val="12"/>
+  <w:num w:numId="24" w16cid:durableId="37903259">
+    <w:abstractNumId w:val="19"/>
   </w:num>
 </w:numbering>
 </file>
@@ -7272,6 +10787,11 @@
       <w:bCs/>
     </w:rPr>
   </w:style>
+  <w:style w:type="character" w:customStyle="1" w:styleId="animating6ta1u10">
+    <w:name w:val="_animating_6ta1u_10"/>
+    <w:basedOn w:val="DefaultParagraphFont"/>
+    <w:rsid w:val="00685642"/>
+  </w:style>
 </w:styles>
 </file>
 

</xml_diff>